<commit_message>
docs(nav): TS-NAV-03·TS-NAV-04 트러블슈팅 이슈 등록
</commit_message>
<xml_diff>
--- a/docs/troubleshooting/AURIX_MediRun_07_트러블슈팅_NAV.docx
+++ b/docs/troubleshooting/AURIX_MediRun_07_트러블슈팅_NAV.docx
@@ -3047,6 +3047,9 @@
             <w:pPr>
               <w:spacing w:after="0" w:before="0" w:line="260"/>
             </w:pPr>
+            <w:r>
+              <w:t>Nav2 회복 동작(후진·회전)이 초음파 안전 정지 게이트를 우회함</w:t>
+            </w:r>
           </w:p>
         </w:tc>
         <w:tc>
@@ -3071,6 +3074,9 @@
               <w:spacing w:after="0" w:before="0" w:line="260"/>
               <w:jc w:val="center"/>
             </w:pPr>
+            <w:r>
+              <w:t>BLOCKER</w:t>
+            </w:r>
           </w:p>
         </w:tc>
         <w:tc>
@@ -3095,6 +3101,9 @@
               <w:spacing w:after="0" w:before="0" w:line="260"/>
               <w:jc w:val="center"/>
             </w:pPr>
+            <w:r>
+              <w:t>RESOLVED</w:t>
+            </w:r>
           </w:p>
         </w:tc>
       </w:tr>
@@ -3154,6 +3163,9 @@
             <w:pPr>
               <w:spacing w:after="0" w:before="0" w:line="260"/>
             </w:pPr>
+            <w:r>
+              <w:t>launch 조건식에 소문자 불리언 전달로 run.sh 기동 실패</w:t>
+            </w:r>
           </w:p>
         </w:tc>
         <w:tc>
@@ -3179,6 +3191,9 @@
               <w:spacing w:after="0" w:before="0" w:line="260"/>
               <w:jc w:val="center"/>
             </w:pPr>
+            <w:r>
+              <w:t>MAJOR</w:t>
+            </w:r>
           </w:p>
         </w:tc>
         <w:tc>
@@ -3204,6 +3219,9 @@
               <w:spacing w:after="0" w:before="0" w:line="260"/>
               <w:jc w:val="center"/>
             </w:pPr>
+            <w:r>
+              <w:t>RESOLVED</w:t>
+            </w:r>
           </w:p>
         </w:tc>
       </w:tr>
@@ -3470,7 +3488,7 @@
                 <w:sz w:val="17"/>
                 <w:szCs w:val="17"/>
               </w:rPr>
-              <w:t xml:space="preserve">2 / 1 / 1</w:t>
+              <w:t>4 / 3 / 1</w:t>
             </w:r>
           </w:p>
         </w:tc>
@@ -7176,6 +7194,3710 @@
             </w:pPr>
             <w:r>
               <w:t xml:space="preserve">원인 미확인 상태로 재발 방지 조치 없음 — 원인 확인 후 갱신 예정</w:t>
+            </w:r>
+          </w:p>
+        </w:tc>
+      </w:tr>
+    </w:tbl>
+    <w:p>
+      <w:pPr>
+        <w:pStyle w:val="Heading2"/>
+        <w:pBdr>
+          <w:left w:val="single" w:color="D9A441" w:sz="24" w:space="8"/>
+        </w:pBdr>
+        <w:spacing w:after="180" w:before="380" w:line="280"/>
+        <w:ind w:left="140"/>
+      </w:pPr>
+      <w:r>
+        <w:rPr>
+          <w:rFonts w:ascii="맑은 고딕" w:cs="맑은 고딕" w:eastAsia="맑은 고딕" w:hAnsi="맑은 고딕"/>
+          <w:b/>
+          <w:bCs/>
+          <w:color w:val="241B12"/>
+          <w:sz w:val="26"/>
+          <w:szCs w:val="26"/>
+        </w:rPr>
+        <w:t>4.3 TS-NAV-03 (Nav2 회복 동작(후진·회전)이 초음파 안전 정지 게이트를 우회함)</w:t>
+      </w:r>
+    </w:p>
+    <w:p>
+      <w:pPr>
+        <w:pStyle w:val="Heading3"/>
+        <w:spacing w:after="120" w:before="260" w:line="260"/>
+      </w:pPr>
+      <w:r>
+        <w:rPr>
+          <w:rFonts w:ascii="맑은 고딕" w:cs="맑은 고딕" w:eastAsia="맑은 고딕" w:hAnsi="맑은 고딕"/>
+          <w:b/>
+          <w:bCs/>
+          <w:color w:val="241B12"/>
+          <w:sz w:val="21"/>
+          <w:szCs w:val="21"/>
+        </w:rPr>
+        <w:t xml:space="preserve">개요</w:t>
+      </w:r>
+    </w:p>
+    <w:tbl>
+      <w:tblPr>
+        <w:tblW w:type="dxa" w:w="9746"/>
+        <w:tblBorders>
+          <w:top w:val="single" w:color="DEDEDE" w:sz="6"/>
+          <w:left w:val="single" w:color="DEDEDE" w:sz="6"/>
+          <w:bottom w:val="single" w:color="DEDEDE" w:sz="6"/>
+          <w:right w:val="single" w:color="DEDEDE" w:sz="6"/>
+          <w:insideH w:val="single" w:color="DEDEDE" w:sz="6"/>
+          <w:insideV w:val="single" w:color="DEDEDE" w:sz="6"/>
+        </w:tblBorders>
+      </w:tblPr>
+      <w:tblGrid>
+        <w:gridCol w:w="2600"/>
+        <w:gridCol w:w="7146"/>
+      </w:tblGrid>
+      <w:tr>
+        <w:trPr>
+          <w:tblHeader/>
+        </w:trPr>
+        <w:tc>
+          <w:tcPr>
+            <w:tcW w:type="dxa" w:w="2600"/>
+            <w:tcBorders>
+              <w:top w:val="single" w:color="49361D" w:sz="6"/>
+              <w:left w:val="single" w:color="49361D" w:sz="6"/>
+              <w:bottom w:val="single" w:color="49361D" w:sz="6"/>
+              <w:right w:val="single" w:color="49361D" w:sz="6"/>
+            </w:tcBorders>
+            <w:shd w:fill="241B12" w:color="auto" w:val="clear"/>
+            <w:tcMar>
+              <w:top w:type="dxa" w:w="90"/>
+              <w:left w:type="dxa" w:w="110"/>
+              <w:bottom w:type="dxa" w:w="90"/>
+              <w:right w:type="dxa" w:w="110"/>
+            </w:tcMar>
+            <w:vAlign w:val="center"/>
+          </w:tcPr>
+          <w:p>
+            <w:pPr>
+              <w:spacing w:after="0" w:before="0" w:line="260"/>
+            </w:pPr>
+            <w:r>
+              <w:rPr>
+                <w:rFonts w:ascii="맑은 고딕" w:cs="맑은 고딕" w:eastAsia="맑은 고딕" w:hAnsi="맑은 고딕"/>
+                <w:b/>
+                <w:bCs/>
+                <w:color w:val="F4CF87"/>
+                <w:sz w:val="17"/>
+                <w:szCs w:val="17"/>
+              </w:rPr>
+              <w:t xml:space="preserve">항목</w:t>
+            </w:r>
+          </w:p>
+        </w:tc>
+        <w:tc>
+          <w:tcPr>
+            <w:tcW w:type="dxa" w:w="7146"/>
+            <w:tcBorders>
+              <w:top w:val="single" w:color="49361D" w:sz="6"/>
+              <w:left w:val="single" w:color="49361D" w:sz="6"/>
+              <w:bottom w:val="single" w:color="49361D" w:sz="6"/>
+              <w:right w:val="single" w:color="49361D" w:sz="6"/>
+            </w:tcBorders>
+            <w:shd w:fill="241B12" w:color="auto" w:val="clear"/>
+            <w:tcMar>
+              <w:top w:type="dxa" w:w="90"/>
+              <w:left w:type="dxa" w:w="110"/>
+              <w:bottom w:type="dxa" w:w="90"/>
+              <w:right w:type="dxa" w:w="110"/>
+            </w:tcMar>
+            <w:vAlign w:val="center"/>
+          </w:tcPr>
+          <w:p>
+            <w:pPr>
+              <w:spacing w:after="0" w:before="0" w:line="260"/>
+            </w:pPr>
+            <w:r>
+              <w:rPr>
+                <w:rFonts w:ascii="맑은 고딕" w:cs="맑은 고딕" w:eastAsia="맑은 고딕" w:hAnsi="맑은 고딕"/>
+                <w:b/>
+                <w:bCs/>
+                <w:color w:val="F4CF87"/>
+                <w:sz w:val="17"/>
+                <w:szCs w:val="17"/>
+              </w:rPr>
+              <w:t xml:space="preserve">내용</w:t>
+            </w:r>
+          </w:p>
+        </w:tc>
+      </w:tr>
+      <w:tr>
+        <w:tc>
+          <w:tcPr>
+            <w:tcW w:type="dxa" w:w="2600"/>
+            <w:tcBorders>
+              <w:top w:val="single" w:color="DEDEDE" w:sz="6"/>
+              <w:left w:val="single" w:color="DEDEDE" w:sz="6"/>
+              <w:bottom w:val="single" w:color="DEDEDE" w:sz="6"/>
+              <w:right w:val="single" w:color="DEDEDE" w:sz="6"/>
+            </w:tcBorders>
+            <w:tcMar>
+              <w:top w:type="dxa" w:w="70"/>
+              <w:left w:type="dxa" w:w="110"/>
+              <w:bottom w:type="dxa" w:w="70"/>
+              <w:right w:type="dxa" w:w="110"/>
+            </w:tcMar>
+            <w:vAlign w:val="center"/>
+          </w:tcPr>
+          <w:p>
+            <w:pPr>
+              <w:spacing w:after="0" w:before="0" w:line="260"/>
+            </w:pPr>
+            <w:r>
+              <w:rPr>
+                <w:rFonts w:ascii="맑은 고딕" w:cs="맑은 고딕" w:eastAsia="맑은 고딕" w:hAnsi="맑은 고딕"/>
+                <w:color w:val="3C3429"/>
+                <w:sz w:val="17"/>
+                <w:szCs w:val="17"/>
+              </w:rPr>
+              <w:t xml:space="preserve">심각도 / 상태</w:t>
+            </w:r>
+          </w:p>
+        </w:tc>
+        <w:tc>
+          <w:tcPr>
+            <w:tcW w:type="dxa" w:w="7146"/>
+            <w:tcBorders>
+              <w:top w:val="single" w:color="DEDEDE" w:sz="6"/>
+              <w:left w:val="single" w:color="DEDEDE" w:sz="6"/>
+              <w:bottom w:val="single" w:color="DEDEDE" w:sz="6"/>
+              <w:right w:val="single" w:color="DEDEDE" w:sz="6"/>
+            </w:tcBorders>
+            <w:tcMar>
+              <w:top w:type="dxa" w:w="70"/>
+              <w:left w:type="dxa" w:w="110"/>
+              <w:bottom w:type="dxa" w:w="70"/>
+              <w:right w:type="dxa" w:w="110"/>
+            </w:tcMar>
+            <w:vAlign w:val="center"/>
+          </w:tcPr>
+          <w:p>
+            <w:pPr>
+              <w:spacing w:after="0" w:before="0" w:line="260"/>
+            </w:pPr>
+            <w:r>
+              <w:rPr>
+                <w:rFonts w:ascii="맑은 고딕" w:cs="맑은 고딕" w:eastAsia="맑은 고딕" w:hAnsi="맑은 고딕"/>
+                <w:color w:val="3C3429"/>
+                <w:sz w:val="17"/>
+                <w:szCs w:val="17"/>
+              </w:rPr>
+              <w:t>BLOCKER / RESOLVED</w:t>
+            </w:r>
+          </w:p>
+        </w:tc>
+      </w:tr>
+      <w:tr>
+        <w:tc>
+          <w:tcPr>
+            <w:tcW w:type="dxa" w:w="2600"/>
+            <w:tcBorders>
+              <w:top w:val="single" w:color="DEDEDE" w:sz="6"/>
+              <w:left w:val="single" w:color="DEDEDE" w:sz="6"/>
+              <w:bottom w:val="single" w:color="DEDEDE" w:sz="6"/>
+              <w:right w:val="single" w:color="DEDEDE" w:sz="6"/>
+            </w:tcBorders>
+            <w:shd w:fill="FAFAFA" w:color="auto" w:val="clear"/>
+            <w:tcMar>
+              <w:top w:type="dxa" w:w="70"/>
+              <w:left w:type="dxa" w:w="110"/>
+              <w:bottom w:type="dxa" w:w="70"/>
+              <w:right w:type="dxa" w:w="110"/>
+            </w:tcMar>
+            <w:vAlign w:val="center"/>
+          </w:tcPr>
+          <w:p>
+            <w:pPr>
+              <w:spacing w:after="0" w:before="0" w:line="260"/>
+            </w:pPr>
+            <w:r>
+              <w:rPr>
+                <w:rFonts w:ascii="맑은 고딕" w:cs="맑은 고딕" w:eastAsia="맑은 고딕" w:hAnsi="맑은 고딕"/>
+                <w:color w:val="3C3429"/>
+                <w:sz w:val="17"/>
+                <w:szCs w:val="17"/>
+              </w:rPr>
+              <w:t xml:space="preserve">발생일 / 해결일</w:t>
+            </w:r>
+          </w:p>
+        </w:tc>
+        <w:tc>
+          <w:tcPr>
+            <w:tcW w:type="dxa" w:w="7146"/>
+            <w:tcBorders>
+              <w:top w:val="single" w:color="DEDEDE" w:sz="6"/>
+              <w:left w:val="single" w:color="DEDEDE" w:sz="6"/>
+              <w:bottom w:val="single" w:color="DEDEDE" w:sz="6"/>
+              <w:right w:val="single" w:color="DEDEDE" w:sz="6"/>
+            </w:tcBorders>
+            <w:shd w:fill="FAFAFA" w:color="auto" w:val="clear"/>
+            <w:tcMar>
+              <w:top w:type="dxa" w:w="70"/>
+              <w:left w:type="dxa" w:w="110"/>
+              <w:bottom w:type="dxa" w:w="70"/>
+              <w:right w:type="dxa" w:w="110"/>
+            </w:tcMar>
+            <w:vAlign w:val="center"/>
+          </w:tcPr>
+          <w:p>
+            <w:pPr>
+              <w:spacing w:after="0" w:before="0" w:line="260"/>
+            </w:pPr>
+            <w:r>
+              <w:rPr>
+                <w:rFonts w:ascii="맑은 고딕" w:cs="맑은 고딕" w:eastAsia="맑은 고딕" w:hAnsi="맑은 고딕"/>
+                <w:color w:val="3C3429"/>
+                <w:sz w:val="17"/>
+                <w:szCs w:val="17"/>
+              </w:rPr>
+              <w:t>2026-08-18 / 2026-08-18</w:t>
+            </w:r>
+          </w:p>
+        </w:tc>
+      </w:tr>
+      <w:tr>
+        <w:tc>
+          <w:tcPr>
+            <w:tcW w:type="dxa" w:w="2600"/>
+            <w:tcBorders>
+              <w:top w:val="single" w:color="DEDEDE" w:sz="6"/>
+              <w:left w:val="single" w:color="DEDEDE" w:sz="6"/>
+              <w:bottom w:val="single" w:color="DEDEDE" w:sz="6"/>
+              <w:right w:val="single" w:color="DEDEDE" w:sz="6"/>
+            </w:tcBorders>
+            <w:tcMar>
+              <w:top w:type="dxa" w:w="70"/>
+              <w:left w:type="dxa" w:w="110"/>
+              <w:bottom w:type="dxa" w:w="70"/>
+              <w:right w:type="dxa" w:w="110"/>
+            </w:tcMar>
+            <w:vAlign w:val="center"/>
+          </w:tcPr>
+          <w:p>
+            <w:pPr>
+              <w:spacing w:after="0" w:before="0" w:line="260"/>
+            </w:pPr>
+            <w:r>
+              <w:rPr>
+                <w:rFonts w:ascii="맑은 고딕" w:cs="맑은 고딕" w:eastAsia="맑은 고딕" w:hAnsi="맑은 고딕"/>
+                <w:color w:val="3C3429"/>
+                <w:sz w:val="17"/>
+                <w:szCs w:val="17"/>
+              </w:rPr>
+              <w:t xml:space="preserve">담당</w:t>
+            </w:r>
+          </w:p>
+        </w:tc>
+        <w:tc>
+          <w:tcPr>
+            <w:tcW w:type="dxa" w:w="7146"/>
+            <w:tcBorders>
+              <w:top w:val="single" w:color="DEDEDE" w:sz="6"/>
+              <w:left w:val="single" w:color="DEDEDE" w:sz="6"/>
+              <w:bottom w:val="single" w:color="DEDEDE" w:sz="6"/>
+              <w:right w:val="single" w:color="DEDEDE" w:sz="6"/>
+            </w:tcBorders>
+            <w:tcMar>
+              <w:top w:type="dxa" w:w="70"/>
+              <w:left w:type="dxa" w:w="110"/>
+              <w:bottom w:type="dxa" w:w="70"/>
+              <w:right w:type="dxa" w:w="110"/>
+            </w:tcMar>
+            <w:vAlign w:val="center"/>
+          </w:tcPr>
+          <w:p>
+            <w:pPr>
+              <w:spacing w:after="0" w:before="0" w:line="260"/>
+            </w:pPr>
+            <w:r>
+              <w:rPr>
+                <w:rFonts w:ascii="맑은 고딕" w:cs="맑은 고딕" w:eastAsia="맑은 고딕" w:hAnsi="맑은 고딕"/>
+                <w:color w:val="3C3429"/>
+                <w:sz w:val="17"/>
+                <w:szCs w:val="17"/>
+              </w:rPr>
+              <w:t>미지정</w:t>
+            </w:r>
+          </w:p>
+        </w:tc>
+      </w:tr>
+      <w:tr>
+        <w:tc>
+          <w:tcPr>
+            <w:tcW w:type="dxa" w:w="2600"/>
+            <w:tcBorders>
+              <w:top w:val="single" w:color="DEDEDE" w:sz="6"/>
+              <w:left w:val="single" w:color="DEDEDE" w:sz="6"/>
+              <w:bottom w:val="single" w:color="DEDEDE" w:sz="6"/>
+              <w:right w:val="single" w:color="DEDEDE" w:sz="6"/>
+            </w:tcBorders>
+            <w:shd w:fill="FAFAFA" w:color="auto" w:val="clear"/>
+            <w:tcMar>
+              <w:top w:type="dxa" w:w="70"/>
+              <w:left w:type="dxa" w:w="110"/>
+              <w:bottom w:type="dxa" w:w="70"/>
+              <w:right w:type="dxa" w:w="110"/>
+            </w:tcMar>
+            <w:vAlign w:val="center"/>
+          </w:tcPr>
+          <w:p>
+            <w:pPr>
+              <w:spacing w:after="0" w:before="0" w:line="260"/>
+            </w:pPr>
+            <w:r>
+              <w:rPr>
+                <w:rFonts w:ascii="맑은 고딕" w:cs="맑은 고딕" w:eastAsia="맑은 고딕" w:hAnsi="맑은 고딕"/>
+                <w:color w:val="3C3429"/>
+                <w:sz w:val="17"/>
+                <w:szCs w:val="17"/>
+              </w:rPr>
+              <w:t xml:space="preserve">환경</w:t>
+            </w:r>
+          </w:p>
+        </w:tc>
+        <w:tc>
+          <w:tcPr>
+            <w:tcW w:type="dxa" w:w="7146"/>
+            <w:tcBorders>
+              <w:top w:val="single" w:color="DEDEDE" w:sz="6"/>
+              <w:left w:val="single" w:color="DEDEDE" w:sz="6"/>
+              <w:bottom w:val="single" w:color="DEDEDE" w:sz="6"/>
+              <w:right w:val="single" w:color="DEDEDE" w:sz="6"/>
+            </w:tcBorders>
+            <w:shd w:fill="FAFAFA" w:color="auto" w:val="clear"/>
+            <w:tcMar>
+              <w:top w:type="dxa" w:w="70"/>
+              <w:left w:type="dxa" w:w="110"/>
+              <w:bottom w:type="dxa" w:w="70"/>
+              <w:right w:type="dxa" w:w="110"/>
+            </w:tcMar>
+            <w:vAlign w:val="center"/>
+          </w:tcPr>
+          <w:p>
+            <w:pPr>
+              <w:spacing w:after="0" w:before="0" w:line="260"/>
+            </w:pPr>
+            <w:r>
+              <w:rPr>
+                <w:rFonts w:ascii="맑은 고딕" w:cs="맑은 고딕" w:eastAsia="맑은 고딕" w:hAnsi="맑은 고딕"/>
+                <w:color w:val="3C3429"/>
+                <w:sz w:val="17"/>
+                <w:szCs w:val="17"/>
+              </w:rPr>
+              <w:t>ROS 2 Humble · Nav2(behavior_server, velocity_smoother) · TurtleBot3 실기 · medirun_bringup, arduino_bridge(ultrasonic_safety_stop)</w:t>
+            </w:r>
+          </w:p>
+        </w:tc>
+      </w:tr>
+      <w:tr>
+        <w:tc>
+          <w:tcPr>
+            <w:tcW w:type="dxa" w:w="2600"/>
+            <w:tcBorders>
+              <w:top w:val="single" w:color="DEDEDE" w:sz="6"/>
+              <w:left w:val="single" w:color="DEDEDE" w:sz="6"/>
+              <w:bottom w:val="single" w:color="DEDEDE" w:sz="6"/>
+              <w:right w:val="single" w:color="DEDEDE" w:sz="6"/>
+            </w:tcBorders>
+            <w:tcMar>
+              <w:top w:type="dxa" w:w="70"/>
+              <w:left w:type="dxa" w:w="110"/>
+              <w:bottom w:type="dxa" w:w="70"/>
+              <w:right w:type="dxa" w:w="110"/>
+            </w:tcMar>
+            <w:vAlign w:val="center"/>
+          </w:tcPr>
+          <w:p>
+            <w:pPr>
+              <w:spacing w:after="0" w:before="0" w:line="260"/>
+            </w:pPr>
+            <w:r>
+              <w:rPr>
+                <w:rFonts w:ascii="맑은 고딕" w:cs="맑은 고딕" w:eastAsia="맑은 고딕" w:hAnsi="맑은 고딕"/>
+                <w:color w:val="3C3429"/>
+                <w:sz w:val="17"/>
+                <w:szCs w:val="17"/>
+              </w:rPr>
+              <w:t xml:space="preserve">관련</w:t>
+            </w:r>
+          </w:p>
+        </w:tc>
+        <w:tc>
+          <w:tcPr>
+            <w:tcW w:type="dxa" w:w="7146"/>
+            <w:tcBorders>
+              <w:top w:val="single" w:color="DEDEDE" w:sz="6"/>
+              <w:left w:val="single" w:color="DEDEDE" w:sz="6"/>
+              <w:bottom w:val="single" w:color="DEDEDE" w:sz="6"/>
+              <w:right w:val="single" w:color="DEDEDE" w:sz="6"/>
+            </w:tcBorders>
+            <w:tcMar>
+              <w:top w:type="dxa" w:w="70"/>
+              <w:left w:type="dxa" w:w="110"/>
+              <w:bottom w:type="dxa" w:w="70"/>
+              <w:right w:type="dxa" w:w="110"/>
+            </w:tcMar>
+            <w:vAlign w:val="center"/>
+          </w:tcPr>
+          <w:p>
+            <w:pPr>
+              <w:spacing w:after="0" w:before="0" w:line="260"/>
+            </w:pPr>
+            <w:r>
+              <w:rPr>
+                <w:rFonts w:ascii="맑은 고딕" w:cs="맑은 고딕" w:eastAsia="맑은 고딕" w:hAnsi="맑은 고딕"/>
+                <w:color w:val="3C3429"/>
+                <w:sz w:val="17"/>
+                <w:szCs w:val="17"/>
+              </w:rPr>
+              <w:t>TS-NAV-04(같은 세션, 이 이슈 조치 직후 연쇄로 발견된 launch 조건식 오류)</w:t>
+            </w:r>
+          </w:p>
+        </w:tc>
+      </w:tr>
+    </w:tbl>
+    <w:p>
+      <w:pPr>
+        <w:pStyle w:val="Heading3"/>
+        <w:spacing w:after="120" w:before="260" w:line="260"/>
+      </w:pPr>
+      <w:r>
+        <w:rPr>
+          <w:rFonts w:ascii="맑은 고딕" w:cs="맑은 고딕" w:eastAsia="맑은 고딕" w:hAnsi="맑은 고딕"/>
+          <w:b/>
+          <w:bCs/>
+          <w:color w:val="241B12"/>
+          <w:sz w:val="21"/>
+          <w:szCs w:val="21"/>
+        </w:rPr>
+        <w:t xml:space="preserve">증상</w:t>
+      </w:r>
+    </w:p>
+    <w:p>
+      <w:pPr>
+        <w:spacing w:after="140" w:before="0" w:line="260"/>
+      </w:pPr>
+      <w:r>
+        <w:rPr>
+          <w:rFonts w:ascii="맑은 고딕" w:cs="맑은 고딕" w:eastAsia="맑은 고딕" w:hAnsi="맑은 고딕"/>
+          <w:color w:val="3C3429"/>
+          <w:sz w:val="17"/>
+          <w:szCs w:val="17"/>
+        </w:rPr>
+        <w:t>전진 중 전방 장애물에는 초음파 안전 정지가 정상 동작했지만, Nav2 회복 동작(BackUp 후진·Spin 회전)이 실행되는 동안에는 후방 또는 전·후방이 15cm 이하로 근접해도 정지하지 않고 그대로 진행됐다.</w:t>
+      </w:r>
+    </w:p>
+    <w:tbl>
+      <w:tblPr>
+        <w:tblW w:type="dxa" w:w="9746"/>
+        <w:tblBorders>
+          <w:top w:val="single" w:color="DEDEDE" w:sz="6"/>
+          <w:left w:val="single" w:color="DEDEDE" w:sz="6"/>
+          <w:bottom w:val="single" w:color="DEDEDE" w:sz="6"/>
+          <w:right w:val="single" w:color="DEDEDE" w:sz="6"/>
+          <w:insideH w:val="single" w:color="DEDEDE" w:sz="6"/>
+          <w:insideV w:val="single" w:color="DEDEDE" w:sz="6"/>
+        </w:tblBorders>
+      </w:tblPr>
+      <w:tblGrid>
+        <w:gridCol w:w="9746"/>
+      </w:tblGrid>
+      <w:tr>
+        <w:tc>
+          <w:tcPr>
+            <w:tcW w:type="dxa" w:w="9746"/>
+            <w:tcBorders>
+              <w:top w:val="single" w:color="DEDEDE" w:sz="6"/>
+              <w:left w:val="single" w:color="DEDEDE" w:sz="6"/>
+              <w:bottom w:val="single" w:color="DEDEDE" w:sz="6"/>
+              <w:right w:val="single" w:color="DEDEDE" w:sz="6"/>
+            </w:tcBorders>
+            <w:shd w:fill="F7F8FA" w:color="auto" w:val="clear"/>
+            <w:tcMar>
+              <w:top w:type="dxa" w:w="140"/>
+              <w:left w:type="dxa" w:w="160"/>
+              <w:bottom w:type="dxa" w:w="140"/>
+              <w:right w:type="dxa" w:w="160"/>
+            </w:tcMar>
+          </w:tcPr>
+          <w:p>
+            <w:pPr>
+              <w:spacing w:after="20" w:line="240"/>
+            </w:pPr>
+            <w:r>
+              <w:rPr>
+                <w:rFonts w:ascii="Consolas" w:cs="Consolas" w:eastAsia="Consolas" w:hAnsi="Consolas"/>
+                <w:color w:val="3C3429"/>
+                <w:sz w:val="16"/>
+                <w:szCs w:val="16"/>
+              </w:rPr>
+              <w:t>$ ros2 topic info /cmd_vel --verbose (조치 전)</w:t>
+              <w:br/>
+              <w:t>/cmd_vel Publisher</w:t>
+              <w:br/>
+              <w:t xml:space="preserve">  - behavior_server 4개 endpoint  ← 안전 게이트 우회</w:t>
+              <w:br/>
+              <w:t xml:space="preserve">  - ultrasonic_safety_stop</w:t>
+              <w:br/>
+              <w:t xml:space="preserve">  - medirun_gui</w:t>
+              <w:br/>
+              <w:t xml:space="preserve">  - estop_node</w:t>
+              <w:br/>
+              <w:t/>
+              <w:br/>
+              <w:t>/medirun/navigation/cmd_vel_raw Publisher</w:t>
+              <w:br/>
+              <w:t xml:space="preserve">  - velocity_smoother만 존재</w:t>
+            </w:r>
+          </w:p>
+        </w:tc>
+      </w:tr>
+    </w:tbl>
+    <w:p>
+      <w:pPr>
+        <w:pStyle w:val="Heading3"/>
+        <w:spacing w:after="120" w:before="260" w:line="260"/>
+      </w:pPr>
+      <w:r>
+        <w:rPr>
+          <w:rFonts w:ascii="맑은 고딕" w:cs="맑은 고딕" w:eastAsia="맑은 고딕" w:hAnsi="맑은 고딕"/>
+          <w:b/>
+          <w:bCs/>
+          <w:color w:val="241B12"/>
+          <w:sz w:val="21"/>
+          <w:szCs w:val="21"/>
+        </w:rPr>
+        <w:t xml:space="preserve">재현 절차</w:t>
+      </w:r>
+    </w:p>
+    <w:tbl>
+      <w:tblPr>
+        <w:tblW w:type="dxa" w:w="9746"/>
+        <w:tblBorders>
+          <w:top w:val="single" w:color="DEDEDE" w:sz="6"/>
+          <w:left w:val="single" w:color="DEDEDE" w:sz="6"/>
+          <w:bottom w:val="single" w:color="DEDEDE" w:sz="6"/>
+          <w:right w:val="single" w:color="DEDEDE" w:sz="6"/>
+          <w:insideH w:val="single" w:color="DEDEDE" w:sz="6"/>
+          <w:insideV w:val="single" w:color="DEDEDE" w:sz="6"/>
+        </w:tblBorders>
+      </w:tblPr>
+      <w:tblGrid>
+        <w:gridCol w:w="1500"/>
+        <w:gridCol w:w="3000"/>
+        <w:gridCol w:w="5246"/>
+      </w:tblGrid>
+      <w:tr>
+        <w:trPr>
+          <w:tblHeader/>
+        </w:trPr>
+        <w:tc>
+          <w:tcPr>
+            <w:tcW w:type="dxa" w:w="1500"/>
+            <w:tcBorders>
+              <w:top w:val="single" w:color="49361D" w:sz="6"/>
+              <w:left w:val="single" w:color="49361D" w:sz="6"/>
+              <w:bottom w:val="single" w:color="49361D" w:sz="6"/>
+              <w:right w:val="single" w:color="49361D" w:sz="6"/>
+            </w:tcBorders>
+            <w:shd w:fill="241B12" w:color="auto" w:val="clear"/>
+            <w:tcMar>
+              <w:top w:type="dxa" w:w="90"/>
+              <w:left w:type="dxa" w:w="110"/>
+              <w:bottom w:type="dxa" w:w="90"/>
+              <w:right w:type="dxa" w:w="110"/>
+            </w:tcMar>
+            <w:vAlign w:val="center"/>
+          </w:tcPr>
+          <w:p>
+            <w:pPr>
+              <w:spacing w:after="0" w:before="0" w:line="260"/>
+            </w:pPr>
+            <w:r>
+              <w:rPr>
+                <w:rFonts w:ascii="맑은 고딕" w:cs="맑은 고딕" w:eastAsia="맑은 고딕" w:hAnsi="맑은 고딕"/>
+                <w:b/>
+                <w:bCs/>
+                <w:color w:val="F4CF87"/>
+                <w:sz w:val="17"/>
+                <w:szCs w:val="17"/>
+              </w:rPr>
+              <w:t xml:space="preserve">#</w:t>
+            </w:r>
+          </w:p>
+        </w:tc>
+        <w:tc>
+          <w:tcPr>
+            <w:tcW w:type="dxa" w:w="3000"/>
+            <w:tcBorders>
+              <w:top w:val="single" w:color="49361D" w:sz="6"/>
+              <w:left w:val="single" w:color="49361D" w:sz="6"/>
+              <w:bottom w:val="single" w:color="49361D" w:sz="6"/>
+              <w:right w:val="single" w:color="49361D" w:sz="6"/>
+            </w:tcBorders>
+            <w:shd w:fill="241B12" w:color="auto" w:val="clear"/>
+            <w:tcMar>
+              <w:top w:type="dxa" w:w="90"/>
+              <w:left w:type="dxa" w:w="110"/>
+              <w:bottom w:type="dxa" w:w="90"/>
+              <w:right w:type="dxa" w:w="110"/>
+            </w:tcMar>
+            <w:vAlign w:val="center"/>
+          </w:tcPr>
+          <w:p>
+            <w:pPr>
+              <w:spacing w:after="0" w:before="0" w:line="260"/>
+            </w:pPr>
+            <w:r>
+              <w:rPr>
+                <w:rFonts w:ascii="맑은 고딕" w:cs="맑은 고딕" w:eastAsia="맑은 고딕" w:hAnsi="맑은 고딕"/>
+                <w:b/>
+                <w:bCs/>
+                <w:color w:val="F4CF87"/>
+                <w:sz w:val="17"/>
+                <w:szCs w:val="17"/>
+              </w:rPr>
+              <w:t xml:space="preserve">동작</w:t>
+            </w:r>
+          </w:p>
+        </w:tc>
+        <w:tc>
+          <w:tcPr>
+            <w:tcW w:type="dxa" w:w="5246"/>
+            <w:tcBorders>
+              <w:top w:val="single" w:color="49361D" w:sz="6"/>
+              <w:left w:val="single" w:color="49361D" w:sz="6"/>
+              <w:bottom w:val="single" w:color="49361D" w:sz="6"/>
+              <w:right w:val="single" w:color="49361D" w:sz="6"/>
+            </w:tcBorders>
+            <w:shd w:fill="241B12" w:color="auto" w:val="clear"/>
+            <w:tcMar>
+              <w:top w:type="dxa" w:w="90"/>
+              <w:left w:type="dxa" w:w="110"/>
+              <w:bottom w:type="dxa" w:w="90"/>
+              <w:right w:type="dxa" w:w="110"/>
+            </w:tcMar>
+            <w:vAlign w:val="center"/>
+          </w:tcPr>
+          <w:p>
+            <w:pPr>
+              <w:spacing w:after="0" w:before="0" w:line="260"/>
+            </w:pPr>
+            <w:r>
+              <w:rPr>
+                <w:rFonts w:ascii="맑은 고딕" w:cs="맑은 고딕" w:eastAsia="맑은 고딕" w:hAnsi="맑은 고딕"/>
+                <w:b/>
+                <w:bCs/>
+                <w:color w:val="F4CF87"/>
+                <w:sz w:val="17"/>
+                <w:szCs w:val="17"/>
+              </w:rPr>
+              <w:t xml:space="preserve">결과</w:t>
+            </w:r>
+          </w:p>
+        </w:tc>
+      </w:tr>
+      <w:tr>
+        <w:tc>
+          <w:tcPr>
+            <w:tcW w:type="dxa" w:w="1500"/>
+            <w:tcBorders>
+              <w:top w:val="single" w:color="DEDEDE" w:sz="6"/>
+              <w:left w:val="single" w:color="DEDEDE" w:sz="6"/>
+              <w:bottom w:val="single" w:color="DEDEDE" w:sz="6"/>
+              <w:right w:val="single" w:color="DEDEDE" w:sz="6"/>
+            </w:tcBorders>
+            <w:tcMar>
+              <w:top w:type="dxa" w:w="70"/>
+              <w:left w:type="dxa" w:w="110"/>
+              <w:bottom w:type="dxa" w:w="70"/>
+              <w:right w:type="dxa" w:w="110"/>
+            </w:tcMar>
+            <w:vAlign w:val="center"/>
+          </w:tcPr>
+          <w:p>
+            <w:pPr>
+              <w:spacing w:after="0" w:before="0" w:line="260"/>
+            </w:pPr>
+            <w:r>
+              <w:rPr>
+                <w:rFonts w:ascii="맑은 고딕" w:cs="맑은 고딕" w:eastAsia="맑은 고딕" w:hAnsi="맑은 고딕"/>
+                <w:color w:val="3C3429"/>
+                <w:sz w:val="17"/>
+                <w:szCs w:val="17"/>
+              </w:rPr>
+              <w:t>1</w:t>
+            </w:r>
+          </w:p>
+        </w:tc>
+        <w:tc>
+          <w:tcPr>
+            <w:tcW w:type="dxa" w:w="3000"/>
+            <w:tcBorders>
+              <w:top w:val="single" w:color="DEDEDE" w:sz="6"/>
+              <w:left w:val="single" w:color="DEDEDE" w:sz="6"/>
+              <w:bottom w:val="single" w:color="DEDEDE" w:sz="6"/>
+              <w:right w:val="single" w:color="DEDEDE" w:sz="6"/>
+            </w:tcBorders>
+            <w:tcMar>
+              <w:top w:type="dxa" w:w="70"/>
+              <w:left w:type="dxa" w:w="110"/>
+              <w:bottom w:type="dxa" w:w="70"/>
+              <w:right w:type="dxa" w:w="110"/>
+            </w:tcMar>
+            <w:vAlign w:val="center"/>
+          </w:tcPr>
+          <w:p>
+            <w:pPr>
+              <w:spacing w:after="0" w:before="0" w:line="260"/>
+            </w:pPr>
+            <w:r>
+              <w:t>웨이포인트 자율주행 중 Nav2가 회복 동작(BackUp 후진 또는 Spin 회전)을 실행하게 한다</w:t>
+            </w:r>
+          </w:p>
+        </w:tc>
+        <w:tc>
+          <w:tcPr>
+            <w:tcW w:type="dxa" w:w="5246"/>
+            <w:tcBorders>
+              <w:top w:val="single" w:color="DEDEDE" w:sz="6"/>
+              <w:left w:val="single" w:color="DEDEDE" w:sz="6"/>
+              <w:bottom w:val="single" w:color="DEDEDE" w:sz="6"/>
+              <w:right w:val="single" w:color="DEDEDE" w:sz="6"/>
+            </w:tcBorders>
+            <w:tcMar>
+              <w:top w:type="dxa" w:w="70"/>
+              <w:left w:type="dxa" w:w="110"/>
+              <w:bottom w:type="dxa" w:w="70"/>
+              <w:right w:type="dxa" w:w="110"/>
+            </w:tcMar>
+            <w:vAlign w:val="center"/>
+          </w:tcPr>
+          <w:p>
+            <w:pPr>
+              <w:spacing w:after="0" w:before="0" w:line="260"/>
+            </w:pPr>
+            <w:r>
+              <w:t>로봇이 후진 또는 제자리·곡선 회전한다</w:t>
+            </w:r>
+          </w:p>
+        </w:tc>
+      </w:tr>
+      <w:tr>
+        <w:tc>
+          <w:tcPr>
+            <w:tcW w:type="dxa" w:w="1500"/>
+            <w:tcBorders>
+              <w:top w:val="single" w:color="DEDEDE" w:sz="6"/>
+              <w:left w:val="single" w:color="DEDEDE" w:sz="6"/>
+              <w:bottom w:val="single" w:color="DEDEDE" w:sz="6"/>
+              <w:right w:val="single" w:color="DEDEDE" w:sz="6"/>
+            </w:tcBorders>
+            <w:shd w:fill="FAFAFA" w:color="auto" w:val="clear"/>
+            <w:tcMar>
+              <w:top w:type="dxa" w:w="70"/>
+              <w:left w:type="dxa" w:w="110"/>
+              <w:bottom w:type="dxa" w:w="70"/>
+              <w:right w:type="dxa" w:w="110"/>
+            </w:tcMar>
+            <w:vAlign w:val="center"/>
+          </w:tcPr>
+          <w:p>
+            <w:pPr>
+              <w:spacing w:after="0" w:before="0" w:line="260"/>
+            </w:pPr>
+            <w:r>
+              <w:rPr>
+                <w:rFonts w:ascii="맑은 고딕" w:cs="맑은 고딕" w:eastAsia="맑은 고딕" w:hAnsi="맑은 고딕"/>
+                <w:color w:val="3C3429"/>
+                <w:sz w:val="17"/>
+                <w:szCs w:val="17"/>
+              </w:rPr>
+              <w:t>2</w:t>
+            </w:r>
+          </w:p>
+        </w:tc>
+        <w:tc>
+          <w:tcPr>
+            <w:tcW w:type="dxa" w:w="3000"/>
+            <w:tcBorders>
+              <w:top w:val="single" w:color="DEDEDE" w:sz="6"/>
+              <w:left w:val="single" w:color="DEDEDE" w:sz="6"/>
+              <w:bottom w:val="single" w:color="DEDEDE" w:sz="6"/>
+              <w:right w:val="single" w:color="DEDEDE" w:sz="6"/>
+            </w:tcBorders>
+            <w:shd w:fill="FAFAFA" w:color="auto" w:val="clear"/>
+            <w:tcMar>
+              <w:top w:type="dxa" w:w="70"/>
+              <w:left w:type="dxa" w:w="110"/>
+              <w:bottom w:type="dxa" w:w="70"/>
+              <w:right w:type="dxa" w:w="110"/>
+            </w:tcMar>
+            <w:vAlign w:val="center"/>
+          </w:tcPr>
+          <w:p>
+            <w:pPr>
+              <w:spacing w:after="0" w:before="0" w:line="260"/>
+            </w:pPr>
+            <w:r>
+              <w:t>해당 회복 동작이 진행되는 동안 관련 방향(후방 또는 전·후방)에 15cm 이내로 장애물을 놓는다</w:t>
+            </w:r>
+          </w:p>
+        </w:tc>
+        <w:tc>
+          <w:tcPr>
+            <w:tcW w:type="dxa" w:w="5246"/>
+            <w:tcBorders>
+              <w:top w:val="single" w:color="DEDEDE" w:sz="6"/>
+              <w:left w:val="single" w:color="DEDEDE" w:sz="6"/>
+              <w:bottom w:val="single" w:color="DEDEDE" w:sz="6"/>
+              <w:right w:val="single" w:color="DEDEDE" w:sz="6"/>
+            </w:tcBorders>
+            <w:shd w:fill="FAFAFA" w:color="auto" w:val="clear"/>
+            <w:tcMar>
+              <w:top w:type="dxa" w:w="70"/>
+              <w:left w:type="dxa" w:w="110"/>
+              <w:bottom w:type="dxa" w:w="70"/>
+              <w:right w:type="dxa" w:w="110"/>
+            </w:tcMar>
+            <w:vAlign w:val="center"/>
+          </w:tcPr>
+          <w:p>
+            <w:pPr>
+              <w:spacing w:after="0" w:before="0" w:line="260"/>
+            </w:pPr>
+            <w:r>
+              <w:t>정지하지 않고 명령이 그대로 통과한다</w:t>
+            </w:r>
+          </w:p>
+        </w:tc>
+      </w:tr>
+      <w:tr>
+        <w:tc>
+          <w:tcPr>
+            <w:tcW w:type="dxa" w:w="1500"/>
+            <w:tcBorders>
+              <w:top w:val="single" w:color="DEDEDE" w:sz="6"/>
+              <w:left w:val="single" w:color="DEDEDE" w:sz="6"/>
+              <w:bottom w:val="single" w:color="DEDEDE" w:sz="6"/>
+              <w:right w:val="single" w:color="DEDEDE" w:sz="6"/>
+            </w:tcBorders>
+            <w:tcMar>
+              <w:top w:type="dxa" w:w="70"/>
+              <w:left w:type="dxa" w:w="110"/>
+              <w:bottom w:type="dxa" w:w="70"/>
+              <w:right w:type="dxa" w:w="110"/>
+            </w:tcMar>
+            <w:vAlign w:val="center"/>
+          </w:tcPr>
+          <w:p>
+            <w:pPr>
+              <w:spacing w:after="0" w:before="0" w:line="260"/>
+            </w:pPr>
+            <w:r>
+              <w:rPr>
+                <w:rFonts w:ascii="맑은 고딕" w:cs="맑은 고딕" w:eastAsia="맑은 고딕" w:hAnsi="맑은 고딕"/>
+                <w:color w:val="3C3429"/>
+                <w:sz w:val="17"/>
+                <w:szCs w:val="17"/>
+              </w:rPr>
+              <w:t>3</w:t>
+            </w:r>
+          </w:p>
+        </w:tc>
+        <w:tc>
+          <w:tcPr>
+            <w:tcW w:type="dxa" w:w="3000"/>
+            <w:tcBorders>
+              <w:top w:val="single" w:color="DEDEDE" w:sz="6"/>
+              <w:left w:val="single" w:color="DEDEDE" w:sz="6"/>
+              <w:bottom w:val="single" w:color="DEDEDE" w:sz="6"/>
+              <w:right w:val="single" w:color="DEDEDE" w:sz="6"/>
+            </w:tcBorders>
+            <w:tcMar>
+              <w:top w:type="dxa" w:w="70"/>
+              <w:left w:type="dxa" w:w="110"/>
+              <w:bottom w:type="dxa" w:w="70"/>
+              <w:right w:type="dxa" w:w="110"/>
+            </w:tcMar>
+            <w:vAlign w:val="center"/>
+          </w:tcPr>
+          <w:p>
+            <w:pPr>
+              <w:spacing w:after="0" w:before="0" w:line="260"/>
+            </w:pPr>
+            <w:r>
+              <w:t>ros2 topic info /cmd_vel --verbose와 /medirun/navigation/cmd_vel_raw --verbose로 실제 Publisher를 확인한다</w:t>
+            </w:r>
+          </w:p>
+        </w:tc>
+        <w:tc>
+          <w:tcPr>
+            <w:tcW w:type="dxa" w:w="5246"/>
+            <w:tcBorders>
+              <w:top w:val="single" w:color="DEDEDE" w:sz="6"/>
+              <w:left w:val="single" w:color="DEDEDE" w:sz="6"/>
+              <w:bottom w:val="single" w:color="DEDEDE" w:sz="6"/>
+              <w:right w:val="single" w:color="DEDEDE" w:sz="6"/>
+            </w:tcBorders>
+            <w:tcMar>
+              <w:top w:type="dxa" w:w="70"/>
+              <w:left w:type="dxa" w:w="110"/>
+              <w:bottom w:type="dxa" w:w="70"/>
+              <w:right w:type="dxa" w:w="110"/>
+            </w:tcMar>
+            <w:vAlign w:val="center"/>
+          </w:tcPr>
+          <w:p>
+            <w:pPr>
+              <w:spacing w:after="0" w:before="0" w:line="260"/>
+            </w:pPr>
+            <w:r>
+              <w:t>behavior_server가 /cmd_vel에 직접 발행 중이며, raw 토픽에는 velocity_smoother만 있음을 확인</w:t>
+            </w:r>
+          </w:p>
+        </w:tc>
+      </w:tr>
+    </w:tbl>
+    <w:p>
+      <w:pPr>
+        <w:spacing w:after="140" w:before="0" w:line="260"/>
+      </w:pPr>
+      <w:r>
+        <w:rPr>
+          <w:rFonts w:ascii="맑은 고딕" w:cs="맑은 고딕" w:eastAsia="맑은 고딕" w:hAnsi="맑은 고딕"/>
+          <w:color w:val="3C3429"/>
+          <w:sz w:val="17"/>
+          <w:szCs w:val="17"/>
+        </w:rPr>
+        <w:t>재현율: 재현 시마다 확인 (직선 전진 방향 안전 정지는 정상, 회복 동작의 후진·회전만 항상 미차단)</w:t>
+      </w:r>
+    </w:p>
+    <w:p>
+      <w:pPr>
+        <w:pStyle w:val="Heading3"/>
+        <w:spacing w:after="120" w:before="260" w:line="260"/>
+      </w:pPr>
+      <w:r>
+        <w:rPr>
+          <w:rFonts w:ascii="맑은 고딕" w:cs="맑은 고딕" w:eastAsia="맑은 고딕" w:hAnsi="맑은 고딕"/>
+          <w:b/>
+          <w:bCs/>
+          <w:color w:val="241B12"/>
+          <w:sz w:val="21"/>
+          <w:szCs w:val="21"/>
+        </w:rPr>
+        <w:t xml:space="preserve">진단 과정</w:t>
+      </w:r>
+    </w:p>
+    <w:tbl>
+      <w:tblPr>
+        <w:tblW w:type="dxa" w:w="9746"/>
+        <w:tblBorders>
+          <w:top w:val="single" w:color="DEDEDE" w:sz="6"/>
+          <w:left w:val="single" w:color="DEDEDE" w:sz="6"/>
+          <w:bottom w:val="single" w:color="DEDEDE" w:sz="6"/>
+          <w:right w:val="single" w:color="DEDEDE" w:sz="6"/>
+          <w:insideH w:val="single" w:color="DEDEDE" w:sz="6"/>
+          <w:insideV w:val="single" w:color="DEDEDE" w:sz="6"/>
+        </w:tblBorders>
+      </w:tblPr>
+      <w:tblGrid>
+        <w:gridCol w:w="1500"/>
+        <w:gridCol w:w="3000"/>
+        <w:gridCol w:w="5246"/>
+      </w:tblGrid>
+      <w:tr>
+        <w:trPr>
+          <w:tblHeader/>
+        </w:trPr>
+        <w:tc>
+          <w:tcPr>
+            <w:tcW w:type="dxa" w:w="1500"/>
+            <w:tcBorders>
+              <w:top w:val="single" w:color="49361D" w:sz="6"/>
+              <w:left w:val="single" w:color="49361D" w:sz="6"/>
+              <w:bottom w:val="single" w:color="49361D" w:sz="6"/>
+              <w:right w:val="single" w:color="49361D" w:sz="6"/>
+            </w:tcBorders>
+            <w:shd w:fill="241B12" w:color="auto" w:val="clear"/>
+            <w:tcMar>
+              <w:top w:type="dxa" w:w="90"/>
+              <w:left w:type="dxa" w:w="110"/>
+              <w:bottom w:type="dxa" w:w="90"/>
+              <w:right w:type="dxa" w:w="110"/>
+            </w:tcMar>
+            <w:vAlign w:val="center"/>
+          </w:tcPr>
+          <w:p>
+            <w:pPr>
+              <w:spacing w:after="0" w:before="0" w:line="260"/>
+            </w:pPr>
+            <w:r>
+              <w:rPr>
+                <w:rFonts w:ascii="맑은 고딕" w:cs="맑은 고딕" w:eastAsia="맑은 고딕" w:hAnsi="맑은 고딕"/>
+                <w:b/>
+                <w:bCs/>
+                <w:color w:val="F4CF87"/>
+                <w:sz w:val="17"/>
+                <w:szCs w:val="17"/>
+              </w:rPr>
+              <w:t xml:space="preserve">가설</w:t>
+            </w:r>
+          </w:p>
+        </w:tc>
+        <w:tc>
+          <w:tcPr>
+            <w:tcW w:type="dxa" w:w="3000"/>
+            <w:tcBorders>
+              <w:top w:val="single" w:color="49361D" w:sz="6"/>
+              <w:left w:val="single" w:color="49361D" w:sz="6"/>
+              <w:bottom w:val="single" w:color="49361D" w:sz="6"/>
+              <w:right w:val="single" w:color="49361D" w:sz="6"/>
+            </w:tcBorders>
+            <w:shd w:fill="241B12" w:color="auto" w:val="clear"/>
+            <w:tcMar>
+              <w:top w:type="dxa" w:w="90"/>
+              <w:left w:type="dxa" w:w="110"/>
+              <w:bottom w:type="dxa" w:w="90"/>
+              <w:right w:type="dxa" w:w="110"/>
+            </w:tcMar>
+            <w:vAlign w:val="center"/>
+          </w:tcPr>
+          <w:p>
+            <w:pPr>
+              <w:spacing w:after="0" w:before="0" w:line="260"/>
+            </w:pPr>
+            <w:r>
+              <w:rPr>
+                <w:rFonts w:ascii="맑은 고딕" w:cs="맑은 고딕" w:eastAsia="맑은 고딕" w:hAnsi="맑은 고딕"/>
+                <w:b/>
+                <w:bCs/>
+                <w:color w:val="F4CF87"/>
+                <w:sz w:val="17"/>
+                <w:szCs w:val="17"/>
+              </w:rPr>
+              <w:t xml:space="preserve">확인 방법</w:t>
+            </w:r>
+          </w:p>
+        </w:tc>
+        <w:tc>
+          <w:tcPr>
+            <w:tcW w:type="dxa" w:w="5246"/>
+            <w:tcBorders>
+              <w:top w:val="single" w:color="49361D" w:sz="6"/>
+              <w:left w:val="single" w:color="49361D" w:sz="6"/>
+              <w:bottom w:val="single" w:color="49361D" w:sz="6"/>
+              <w:right w:val="single" w:color="49361D" w:sz="6"/>
+            </w:tcBorders>
+            <w:shd w:fill="241B12" w:color="auto" w:val="clear"/>
+            <w:tcMar>
+              <w:top w:type="dxa" w:w="90"/>
+              <w:left w:type="dxa" w:w="110"/>
+              <w:bottom w:type="dxa" w:w="90"/>
+              <w:right w:type="dxa" w:w="110"/>
+            </w:tcMar>
+            <w:vAlign w:val="center"/>
+          </w:tcPr>
+          <w:p>
+            <w:pPr>
+              <w:spacing w:after="0" w:before="0" w:line="260"/>
+            </w:pPr>
+            <w:r>
+              <w:rPr>
+                <w:rFonts w:ascii="맑은 고딕" w:cs="맑은 고딕" w:eastAsia="맑은 고딕" w:hAnsi="맑은 고딕"/>
+                <w:b/>
+                <w:bCs/>
+                <w:color w:val="F4CF87"/>
+                <w:sz w:val="17"/>
+                <w:szCs w:val="17"/>
+              </w:rPr>
+              <w:t xml:space="preserve">결과</w:t>
+            </w:r>
+          </w:p>
+        </w:tc>
+      </w:tr>
+      <w:tr>
+        <w:tc>
+          <w:tcPr>
+            <w:tcW w:type="dxa" w:w="1500"/>
+            <w:tcBorders>
+              <w:top w:val="single" w:color="DEDEDE" w:sz="6"/>
+              <w:left w:val="single" w:color="DEDEDE" w:sz="6"/>
+              <w:bottom w:val="single" w:color="DEDEDE" w:sz="6"/>
+              <w:right w:val="single" w:color="DEDEDE" w:sz="6"/>
+            </w:tcBorders>
+            <w:tcMar>
+              <w:top w:type="dxa" w:w="70"/>
+              <w:left w:type="dxa" w:w="110"/>
+              <w:bottom w:type="dxa" w:w="70"/>
+              <w:right w:type="dxa" w:w="110"/>
+            </w:tcMar>
+            <w:vAlign w:val="center"/>
+          </w:tcPr>
+          <w:p>
+            <w:pPr>
+              <w:spacing w:after="0" w:before="0" w:line="260"/>
+            </w:pPr>
+            <w:r>
+              <w:t>안전 노드(ultrasonic_safety_stop) 로직 자체의 버그다</w:t>
+            </w:r>
+          </w:p>
+        </w:tc>
+        <w:tc>
+          <w:tcPr>
+            <w:tcW w:type="dxa" w:w="3000"/>
+            <w:tcBorders>
+              <w:top w:val="single" w:color="DEDEDE" w:sz="6"/>
+              <w:left w:val="single" w:color="DEDEDE" w:sz="6"/>
+              <w:bottom w:val="single" w:color="DEDEDE" w:sz="6"/>
+              <w:right w:val="single" w:color="DEDEDE" w:sz="6"/>
+            </w:tcBorders>
+            <w:tcMar>
+              <w:top w:type="dxa" w:w="70"/>
+              <w:left w:type="dxa" w:w="110"/>
+              <w:bottom w:type="dxa" w:w="70"/>
+              <w:right w:type="dxa" w:w="110"/>
+            </w:tcMar>
+            <w:vAlign w:val="center"/>
+          </w:tcPr>
+          <w:p>
+            <w:pPr>
+              <w:spacing w:after="0" w:before="0" w:line="260"/>
+            </w:pPr>
+            <w:r>
+              <w:t>격리 토픽으로 전진 방향 차단 로직을 재검증</w:t>
+            </w:r>
+          </w:p>
+        </w:tc>
+        <w:tc>
+          <w:tcPr>
+            <w:tcW w:type="dxa" w:w="5246"/>
+            <w:tcBorders>
+              <w:top w:val="single" w:color="DEDEDE" w:sz="6"/>
+              <w:left w:val="single" w:color="DEDEDE" w:sz="6"/>
+              <w:bottom w:val="single" w:color="DEDEDE" w:sz="6"/>
+              <w:right w:val="single" w:color="DEDEDE" w:sz="6"/>
+            </w:tcBorders>
+            <w:tcMar>
+              <w:top w:type="dxa" w:w="70"/>
+              <w:left w:type="dxa" w:w="110"/>
+              <w:bottom w:type="dxa" w:w="70"/>
+              <w:right w:type="dxa" w:w="110"/>
+            </w:tcMar>
+            <w:vAlign w:val="center"/>
+          </w:tcPr>
+          <w:p>
+            <w:pPr>
+              <w:spacing w:after="0" w:before="0" w:line="260"/>
+            </w:pPr>
+            <w:r>
+              <w:rPr>
+                <w:rFonts w:ascii="맑은 고딕" w:cs="맑은 고딕" w:eastAsia="맑은 고딕" w:hAnsi="맑은 고딕"/>
+                <w:color w:val="3C3429"/>
+                <w:sz w:val="17"/>
+                <w:szCs w:val="17"/>
+              </w:rPr>
+              <w:t>아님 — 전진 경로는 정상 차단됨</w:t>
+            </w:r>
+          </w:p>
+        </w:tc>
+      </w:tr>
+      <w:tr>
+        <w:tc>
+          <w:tcPr>
+            <w:tcW w:type="dxa" w:w="1500"/>
+            <w:tcBorders>
+              <w:top w:val="single" w:color="DEDEDE" w:sz="6"/>
+              <w:left w:val="single" w:color="DEDEDE" w:sz="6"/>
+              <w:bottom w:val="single" w:color="DEDEDE" w:sz="6"/>
+              <w:right w:val="single" w:color="DEDEDE" w:sz="6"/>
+            </w:tcBorders>
+            <w:shd w:fill="FAFAFA" w:color="auto" w:val="clear"/>
+            <w:tcMar>
+              <w:top w:type="dxa" w:w="70"/>
+              <w:left w:type="dxa" w:w="110"/>
+              <w:bottom w:type="dxa" w:w="70"/>
+              <w:right w:type="dxa" w:w="110"/>
+            </w:tcMar>
+            <w:vAlign w:val="center"/>
+          </w:tcPr>
+          <w:p>
+            <w:pPr>
+              <w:spacing w:after="0" w:before="0" w:line="260"/>
+            </w:pPr>
+            <w:r>
+              <w:t>안전 게이트를 거치지 않는 별도 발행 경로가 있다</w:t>
+            </w:r>
+          </w:p>
+        </w:tc>
+        <w:tc>
+          <w:tcPr>
+            <w:tcW w:type="dxa" w:w="3000"/>
+            <w:tcBorders>
+              <w:top w:val="single" w:color="DEDEDE" w:sz="6"/>
+              <w:left w:val="single" w:color="DEDEDE" w:sz="6"/>
+              <w:bottom w:val="single" w:color="DEDEDE" w:sz="6"/>
+              <w:right w:val="single" w:color="DEDEDE" w:sz="6"/>
+            </w:tcBorders>
+            <w:shd w:fill="FAFAFA" w:color="auto" w:val="clear"/>
+            <w:tcMar>
+              <w:top w:type="dxa" w:w="70"/>
+              <w:left w:type="dxa" w:w="110"/>
+              <w:bottom w:type="dxa" w:w="70"/>
+              <w:right w:type="dxa" w:w="110"/>
+            </w:tcMar>
+            <w:vAlign w:val="center"/>
+          </w:tcPr>
+          <w:p>
+            <w:pPr>
+              <w:spacing w:after="0" w:before="0" w:line="260"/>
+            </w:pPr>
+            <w:r>
+              <w:t>ros2 topic info /cmd_vel --verbose, /medirun/navigation/cmd_vel_raw --verbose로 실제 Publisher 목록 확인</w:t>
+            </w:r>
+          </w:p>
+        </w:tc>
+        <w:tc>
+          <w:tcPr>
+            <w:tcW w:type="dxa" w:w="5246"/>
+            <w:tcBorders>
+              <w:top w:val="single" w:color="DEDEDE" w:sz="6"/>
+              <w:left w:val="single" w:color="DEDEDE" w:sz="6"/>
+              <w:bottom w:val="single" w:color="DEDEDE" w:sz="6"/>
+              <w:right w:val="single" w:color="DEDEDE" w:sz="6"/>
+            </w:tcBorders>
+            <w:shd w:fill="FAFAFA" w:color="auto" w:val="clear"/>
+            <w:tcMar>
+              <w:top w:type="dxa" w:w="70"/>
+              <w:left w:type="dxa" w:w="110"/>
+              <w:bottom w:type="dxa" w:w="70"/>
+              <w:right w:type="dxa" w:w="110"/>
+            </w:tcMar>
+            <w:vAlign w:val="center"/>
+          </w:tcPr>
+          <w:p>
+            <w:pPr>
+              <w:spacing w:after="0" w:before="0" w:line="260"/>
+            </w:pPr>
+            <w:r>
+              <w:rPr>
+                <w:rFonts w:ascii="맑은 고딕" w:cs="맑은 고딕" w:eastAsia="맑은 고딕" w:hAnsi="맑은 고딕"/>
+                <w:color w:val="3C3429"/>
+                <w:sz w:val="17"/>
+                <w:szCs w:val="17"/>
+              </w:rPr>
+              <w:t>맞음 — behavior_server가 /cmd_vel에 직접 발행하고, raw 토픽은 velocity_smoother만 거침</w:t>
+            </w:r>
+          </w:p>
+        </w:tc>
+      </w:tr>
+    </w:tbl>
+    <w:p>
+      <w:pPr>
+        <w:pStyle w:val="Heading3"/>
+        <w:spacing w:after="120" w:before="260" w:line="260"/>
+      </w:pPr>
+      <w:r>
+        <w:rPr>
+          <w:rFonts w:ascii="맑은 고딕" w:cs="맑은 고딕" w:eastAsia="맑은 고딕" w:hAnsi="맑은 고딕"/>
+          <w:b/>
+          <w:bCs/>
+          <w:color w:val="241B12"/>
+          <w:sz w:val="21"/>
+          <w:szCs w:val="21"/>
+        </w:rPr>
+        <w:t xml:space="preserve">원인</w:t>
+      </w:r>
+    </w:p>
+    <w:p>
+      <w:pPr>
+        <w:spacing w:after="140" w:before="0" w:line="260"/>
+      </w:pPr>
+      <w:r>
+        <w:rPr>
+          <w:rFonts w:ascii="맑은 고딕" w:cs="맑은 고딕" w:eastAsia="맑은 고딕" w:hAnsi="맑은 고딕"/>
+          <w:color w:val="3C3429"/>
+          <w:sz w:val="17"/>
+          <w:szCs w:val="17"/>
+        </w:rPr>
+        <w:t>확인됨. Nav2의 velocity_smoother 최종 출력은 MediRun 안전 게이트(/medirun/navigation/cmd_vel_raw → ultrasonic_safety_stop)를 거치도록 배선돼 있었지만, 회복 동작을 담당하는 behavior_server(BackUp/Spin/DriveOnHeading)는 같은 배선을 타지 않고 자체적으로 /cmd_vel에 직접 발행하고 있었다. 이 때문에 전진 안전 정지는 정상 동작했지만 회복 동작 중 후진·회전은 초음파 판단을 완전히 건너뛰었다.</w:t>
+      </w:r>
+    </w:p>
+    <w:p>
+      <w:pPr>
+        <w:pStyle w:val="Heading3"/>
+        <w:spacing w:after="120" w:before="260" w:line="260"/>
+      </w:pPr>
+      <w:r>
+        <w:rPr>
+          <w:rFonts w:ascii="맑은 고딕" w:cs="맑은 고딕" w:eastAsia="맑은 고딕" w:hAnsi="맑은 고딕"/>
+          <w:b/>
+          <w:bCs/>
+          <w:color w:val="241B12"/>
+          <w:sz w:val="21"/>
+          <w:szCs w:val="21"/>
+        </w:rPr>
+        <w:t xml:space="preserve">조치</w:t>
+      </w:r>
+    </w:p>
+    <w:tbl>
+      <w:tblPr>
+        <w:tblW w:type="dxa" w:w="9746"/>
+        <w:tblBorders>
+          <w:top w:val="single" w:color="DEDEDE" w:sz="6"/>
+          <w:left w:val="single" w:color="DEDEDE" w:sz="6"/>
+          <w:bottom w:val="single" w:color="DEDEDE" w:sz="6"/>
+          <w:right w:val="single" w:color="DEDEDE" w:sz="6"/>
+          <w:insideH w:val="single" w:color="DEDEDE" w:sz="6"/>
+          <w:insideV w:val="single" w:color="DEDEDE" w:sz="6"/>
+        </w:tblBorders>
+      </w:tblPr>
+      <w:tblGrid>
+        <w:gridCol w:w="1500"/>
+        <w:gridCol w:w="3000"/>
+        <w:gridCol w:w="5246"/>
+      </w:tblGrid>
+      <w:tr>
+        <w:trPr>
+          <w:tblHeader/>
+        </w:trPr>
+        <w:tc>
+          <w:tcPr>
+            <w:tcW w:type="dxa" w:w="1500"/>
+            <w:tcBorders>
+              <w:top w:val="single" w:color="49361D" w:sz="6"/>
+              <w:left w:val="single" w:color="49361D" w:sz="6"/>
+              <w:bottom w:val="single" w:color="49361D" w:sz="6"/>
+              <w:right w:val="single" w:color="49361D" w:sz="6"/>
+            </w:tcBorders>
+            <w:shd w:fill="241B12" w:color="auto" w:val="clear"/>
+            <w:tcMar>
+              <w:top w:type="dxa" w:w="90"/>
+              <w:left w:type="dxa" w:w="110"/>
+              <w:bottom w:type="dxa" w:w="90"/>
+              <w:right w:type="dxa" w:w="110"/>
+            </w:tcMar>
+            <w:vAlign w:val="center"/>
+          </w:tcPr>
+          <w:p>
+            <w:pPr>
+              <w:spacing w:after="0" w:before="0" w:line="260"/>
+            </w:pPr>
+            <w:r>
+              <w:rPr>
+                <w:rFonts w:ascii="맑은 고딕" w:cs="맑은 고딕" w:eastAsia="맑은 고딕" w:hAnsi="맑은 고딕"/>
+                <w:b/>
+                <w:bCs/>
+                <w:color w:val="F4CF87"/>
+                <w:sz w:val="17"/>
+                <w:szCs w:val="17"/>
+              </w:rPr>
+              <w:t xml:space="preserve">대상</w:t>
+            </w:r>
+          </w:p>
+        </w:tc>
+        <w:tc>
+          <w:tcPr>
+            <w:tcW w:type="dxa" w:w="3000"/>
+            <w:tcBorders>
+              <w:top w:val="single" w:color="49361D" w:sz="6"/>
+              <w:left w:val="single" w:color="49361D" w:sz="6"/>
+              <w:bottom w:val="single" w:color="49361D" w:sz="6"/>
+              <w:right w:val="single" w:color="49361D" w:sz="6"/>
+            </w:tcBorders>
+            <w:shd w:fill="241B12" w:color="auto" w:val="clear"/>
+            <w:tcMar>
+              <w:top w:type="dxa" w:w="90"/>
+              <w:left w:type="dxa" w:w="110"/>
+              <w:bottom w:type="dxa" w:w="90"/>
+              <w:right w:type="dxa" w:w="110"/>
+            </w:tcMar>
+            <w:vAlign w:val="center"/>
+          </w:tcPr>
+          <w:p>
+            <w:pPr>
+              <w:spacing w:after="0" w:before="0" w:line="260"/>
+            </w:pPr>
+            <w:r>
+              <w:rPr>
+                <w:rFonts w:ascii="맑은 고딕" w:cs="맑은 고딕" w:eastAsia="맑은 고딕" w:hAnsi="맑은 고딕"/>
+                <w:b/>
+                <w:bCs/>
+                <w:color w:val="F4CF87"/>
+                <w:sz w:val="17"/>
+                <w:szCs w:val="17"/>
+              </w:rPr>
+              <w:t xml:space="preserve">변경 전</w:t>
+            </w:r>
+          </w:p>
+        </w:tc>
+        <w:tc>
+          <w:tcPr>
+            <w:tcW w:type="dxa" w:w="5246"/>
+            <w:tcBorders>
+              <w:top w:val="single" w:color="49361D" w:sz="6"/>
+              <w:left w:val="single" w:color="49361D" w:sz="6"/>
+              <w:bottom w:val="single" w:color="49361D" w:sz="6"/>
+              <w:right w:val="single" w:color="49361D" w:sz="6"/>
+            </w:tcBorders>
+            <w:shd w:fill="241B12" w:color="auto" w:val="clear"/>
+            <w:tcMar>
+              <w:top w:type="dxa" w:w="90"/>
+              <w:left w:type="dxa" w:w="110"/>
+              <w:bottom w:type="dxa" w:w="90"/>
+              <w:right w:type="dxa" w:w="110"/>
+            </w:tcMar>
+            <w:vAlign w:val="center"/>
+          </w:tcPr>
+          <w:p>
+            <w:pPr>
+              <w:spacing w:after="0" w:before="0" w:line="260"/>
+            </w:pPr>
+            <w:r>
+              <w:rPr>
+                <w:rFonts w:ascii="맑은 고딕" w:cs="맑은 고딕" w:eastAsia="맑은 고딕" w:hAnsi="맑은 고딕"/>
+                <w:b/>
+                <w:bCs/>
+                <w:color w:val="F4CF87"/>
+                <w:sz w:val="17"/>
+                <w:szCs w:val="17"/>
+              </w:rPr>
+              <w:t xml:space="preserve">변경 후</w:t>
+            </w:r>
+          </w:p>
+        </w:tc>
+      </w:tr>
+      <w:tr>
+        <w:tc>
+          <w:tcPr>
+            <w:tcW w:type="dxa" w:w="1500"/>
+            <w:tcBorders>
+              <w:top w:val="single" w:color="DEDEDE" w:sz="6"/>
+              <w:left w:val="single" w:color="DEDEDE" w:sz="6"/>
+              <w:bottom w:val="single" w:color="DEDEDE" w:sz="6"/>
+              <w:right w:val="single" w:color="DEDEDE" w:sz="6"/>
+            </w:tcBorders>
+            <w:tcMar>
+              <w:top w:type="dxa" w:w="70"/>
+              <w:left w:type="dxa" w:w="110"/>
+              <w:bottom w:type="dxa" w:w="70"/>
+              <w:right w:type="dxa" w:w="110"/>
+            </w:tcMar>
+            <w:vAlign w:val="center"/>
+          </w:tcPr>
+          <w:p>
+            <w:pPr>
+              <w:spacing w:after="0" w:before="0" w:line="260"/>
+            </w:pPr>
+            <w:r>
+              <w:rPr>
+                <w:rFonts w:ascii="맑은 고딕" w:cs="맑은 고딕" w:eastAsia="맑은 고딕" w:hAnsi="맑은 고딕"/>
+                <w:color w:val="3C3429"/>
+                <w:sz w:val="17"/>
+                <w:szCs w:val="17"/>
+              </w:rPr>
+              <w:t>navigation_safety.launch.py 신설, bringup.launch.py 배선 통합</w:t>
+            </w:r>
+          </w:p>
+        </w:tc>
+        <w:tc>
+          <w:tcPr>
+            <w:tcW w:type="dxa" w:w="3000"/>
+            <w:tcBorders>
+              <w:top w:val="single" w:color="DEDEDE" w:sz="6"/>
+              <w:left w:val="single" w:color="DEDEDE" w:sz="6"/>
+              <w:bottom w:val="single" w:color="DEDEDE" w:sz="6"/>
+              <w:right w:val="single" w:color="DEDEDE" w:sz="6"/>
+            </w:tcBorders>
+            <w:tcMar>
+              <w:top w:type="dxa" w:w="70"/>
+              <w:left w:type="dxa" w:w="110"/>
+              <w:bottom w:type="dxa" w:w="70"/>
+              <w:right w:type="dxa" w:w="110"/>
+            </w:tcMar>
+            <w:vAlign w:val="center"/>
+          </w:tcPr>
+          <w:p>
+            <w:pPr>
+              <w:spacing w:after="0" w:before="0" w:line="260"/>
+            </w:pPr>
+            <w:r>
+              <w:t>없음 — behavior_server가 /cmd_vel에 직접 발행</w:t>
+            </w:r>
+          </w:p>
+        </w:tc>
+        <w:tc>
+          <w:tcPr>
+            <w:tcW w:type="dxa" w:w="5246"/>
+            <w:tcBorders>
+              <w:top w:val="single" w:color="DEDEDE" w:sz="6"/>
+              <w:left w:val="single" w:color="DEDEDE" w:sz="6"/>
+              <w:bottom w:val="single" w:color="DEDEDE" w:sz="6"/>
+              <w:right w:val="single" w:color="DEDEDE" w:sz="6"/>
+            </w:tcBorders>
+            <w:tcMar>
+              <w:top w:type="dxa" w:w="70"/>
+              <w:left w:type="dxa" w:w="110"/>
+              <w:bottom w:type="dxa" w:w="70"/>
+              <w:right w:type="dxa" w:w="110"/>
+            </w:tcMar>
+            <w:vAlign w:val="center"/>
+          </w:tcPr>
+          <w:p>
+            <w:pPr>
+              <w:spacing w:after="0" w:before="0" w:line="260"/>
+            </w:pPr>
+            <w:r>
+              <w:t>velocity_smoother와 behavior_server의 cmd_vel을 모두 /medirun/navigation/cmd_vel_raw로 remap하고, ultrasonic_safety_stop만 최종 /cmd_vel을 발행하도록 Nav2 자율주행 경로를 통일</w:t>
+            </w:r>
+          </w:p>
+        </w:tc>
+      </w:tr>
+    </w:tbl>
+    <w:tbl>
+      <w:tblPr>
+        <w:tblW w:type="dxa" w:w="9746"/>
+        <w:tblBorders>
+          <w:top w:val="single" w:color="DEDEDE" w:sz="6"/>
+          <w:left w:val="single" w:color="DEDEDE" w:sz="6"/>
+          <w:bottom w:val="single" w:color="DEDEDE" w:sz="6"/>
+          <w:right w:val="single" w:color="DEDEDE" w:sz="6"/>
+          <w:insideH w:val="single" w:color="DEDEDE" w:sz="6"/>
+          <w:insideV w:val="single" w:color="DEDEDE" w:sz="6"/>
+        </w:tblBorders>
+      </w:tblPr>
+      <w:tblGrid>
+        <w:gridCol w:w="9746"/>
+      </w:tblGrid>
+      <w:tr>
+        <w:tc>
+          <w:tcPr>
+            <w:tcW w:type="dxa" w:w="9746"/>
+            <w:tcBorders>
+              <w:top w:val="single" w:color="DEDEDE" w:sz="6"/>
+              <w:left w:val="single" w:color="DEDEDE" w:sz="6"/>
+              <w:bottom w:val="single" w:color="DEDEDE" w:sz="6"/>
+              <w:right w:val="single" w:color="DEDEDE" w:sz="6"/>
+            </w:tcBorders>
+            <w:shd w:fill="F7F8FA" w:color="auto" w:val="clear"/>
+            <w:tcMar>
+              <w:top w:type="dxa" w:w="140"/>
+              <w:left w:type="dxa" w:w="160"/>
+              <w:bottom w:type="dxa" w:w="140"/>
+              <w:right w:type="dxa" w:w="160"/>
+            </w:tcMar>
+          </w:tcPr>
+          <w:p>
+            <w:pPr>
+              <w:spacing w:after="20" w:line="240"/>
+            </w:pPr>
+            <w:r>
+              <w:rPr>
+                <w:rFonts w:ascii="Consolas" w:cs="Consolas" w:eastAsia="Consolas" w:hAnsi="Consolas"/>
+                <w:color w:val="3C3429"/>
+                <w:sz w:val="16"/>
+                <w:szCs w:val="16"/>
+              </w:rPr>
+              <w:t># 변경 파일</w:t>
+              <w:br/>
+              <w:t>src/medirun_bringup/launch/navigation_safety.launch.py — 신설, velocity_smoother/behavior_server의 cmd_vel을 /medirun/navigation/cmd_vel_raw로 remap</w:t>
+              <w:br/>
+              <w:t>src/medirun_bringup/launch/bringup.launch.py — MediRun 전용 navigation_safety.launch.py를 같은 nav2_container에 포함</w:t>
+            </w:r>
+          </w:p>
+        </w:tc>
+      </w:tr>
+    </w:tbl>
+    <w:p>
+      <w:pPr>
+        <w:pStyle w:val="Heading3"/>
+        <w:spacing w:after="120" w:before="260" w:line="260"/>
+      </w:pPr>
+      <w:r>
+        <w:rPr>
+          <w:rFonts w:ascii="맑은 고딕" w:cs="맑은 고딕" w:eastAsia="맑은 고딕" w:hAnsi="맑은 고딕"/>
+          <w:b/>
+          <w:bCs/>
+          <w:color w:val="241B12"/>
+          <w:sz w:val="21"/>
+          <w:szCs w:val="21"/>
+        </w:rPr>
+        <w:t xml:space="preserve">검증</w:t>
+      </w:r>
+    </w:p>
+    <w:p>
+      <w:pPr>
+        <w:pStyle w:val="ListParagraph"/>
+        <w:numPr>
+          <w:ilvl w:val="0"/>
+          <w:numId w:val="2"/>
+        </w:numPr>
+        <w:spacing w:after="80" w:line="260"/>
+      </w:pPr>
+      <w:r>
+        <w:rPr>
+          <w:rFonts w:ascii="맑은 고딕" w:cs="맑은 고딕" w:eastAsia="맑은 고딕" w:hAnsi="맑은 고딕"/>
+          <w:color w:val="3C3429"/>
+          <w:sz w:val="17"/>
+          <w:szCs w:val="17"/>
+        </w:rPr>
+        <w:t>재시작 후 ros2 topic info /cmd_vel --verbose와 /medirun/navigation/cmd_vel_raw --verbose로 behavior_server가 /cmd_vel에는 없고 raw 토픽에만 있음을 확인</w:t>
+      </w:r>
+    </w:p>
+    <w:p>
+      <w:pPr>
+        <w:pStyle w:val="ListParagraph"/>
+        <w:numPr>
+          <w:ilvl w:val="0"/>
+          <w:numId w:val="2"/>
+        </w:numPr>
+        <w:spacing w:after="80" w:line="260"/>
+      </w:pPr>
+      <w:r>
+        <w:rPr>
+          <w:rFonts w:ascii="맑은 고딕" w:cs="맑은 고딕" w:eastAsia="맑은 고딕" w:hAnsi="맑은 고딕"/>
+          <w:color w:val="3C3429"/>
+          <w:sz w:val="17"/>
+          <w:szCs w:val="17"/>
+        </w:rPr>
+        <w:t>격리 토픽(/test_ultrasonic/*)으로 전방·후방 각각 전진·후진·회전 조합을 재현해 방향별 차단과 반대 방향 허용이 모두 기존 기준대로 동작함을 확인</w:t>
+      </w:r>
+    </w:p>
+    <w:p>
+      <w:pPr>
+        <w:pStyle w:val="ListParagraph"/>
+        <w:numPr>
+          <w:ilvl w:val="0"/>
+          <w:numId w:val="2"/>
+        </w:numPr>
+        <w:spacing w:after="80" w:line="260"/>
+      </w:pPr>
+      <w:r>
+        <w:rPr>
+          <w:rFonts w:ascii="맑은 고딕" w:cs="맑은 고딕" w:eastAsia="맑은 고딕" w:hAnsi="맑은 고딕"/>
+          <w:color w:val="3C3429"/>
+          <w:sz w:val="17"/>
+          <w:szCs w:val="17"/>
+        </w:rPr>
+        <w:t>ROS와 분리한 UltrasonicSafetyPolicy 단위 테스트 6건(전방·후방 방향 차단, 제자리·곡선 회전 차단, 센서 콜백 즉시 정지, 15cm 초과 즉시 해제, 런타임 파라미터 변경) 전부 통과 — colcon test --packages-select arduino_bridge</w:t>
+      </w:r>
+    </w:p>
+    <w:p>
+      <w:pPr>
+        <w:pStyle w:val="Heading3"/>
+        <w:spacing w:after="120" w:before="260" w:line="260"/>
+      </w:pPr>
+      <w:r>
+        <w:rPr>
+          <w:rFonts w:ascii="맑은 고딕" w:cs="맑은 고딕" w:eastAsia="맑은 고딕" w:hAnsi="맑은 고딕"/>
+          <w:b/>
+          <w:bCs/>
+          <w:color w:val="241B12"/>
+          <w:sz w:val="21"/>
+          <w:szCs w:val="21"/>
+        </w:rPr>
+        <w:t xml:space="preserve">재발 방지</w:t>
+      </w:r>
+    </w:p>
+    <w:tbl>
+      <w:tblPr>
+        <w:tblW w:type="dxa" w:w="9746"/>
+        <w:tblBorders>
+          <w:top w:val="single" w:color="DEDEDE" w:sz="6"/>
+          <w:left w:val="single" w:color="DEDEDE" w:sz="6"/>
+          <w:bottom w:val="single" w:color="DEDEDE" w:sz="6"/>
+          <w:right w:val="single" w:color="DEDEDE" w:sz="6"/>
+          <w:insideH w:val="single" w:color="DEDEDE" w:sz="6"/>
+          <w:insideV w:val="single" w:color="DEDEDE" w:sz="6"/>
+        </w:tblBorders>
+      </w:tblPr>
+      <w:tblGrid>
+        <w:gridCol w:w="2600"/>
+        <w:gridCol w:w="7146"/>
+      </w:tblGrid>
+      <w:tr>
+        <w:trPr>
+          <w:tblHeader/>
+        </w:trPr>
+        <w:tc>
+          <w:tcPr>
+            <w:tcW w:type="dxa" w:w="2600"/>
+            <w:tcBorders>
+              <w:top w:val="single" w:color="49361D" w:sz="6"/>
+              <w:left w:val="single" w:color="49361D" w:sz="6"/>
+              <w:bottom w:val="single" w:color="49361D" w:sz="6"/>
+              <w:right w:val="single" w:color="49361D" w:sz="6"/>
+            </w:tcBorders>
+            <w:shd w:fill="241B12" w:color="auto" w:val="clear"/>
+            <w:tcMar>
+              <w:top w:type="dxa" w:w="90"/>
+              <w:left w:type="dxa" w:w="110"/>
+              <w:bottom w:type="dxa" w:w="90"/>
+              <w:right w:type="dxa" w:w="110"/>
+            </w:tcMar>
+            <w:vAlign w:val="center"/>
+          </w:tcPr>
+          <w:p>
+            <w:pPr>
+              <w:spacing w:after="0" w:before="0" w:line="260"/>
+            </w:pPr>
+            <w:r>
+              <w:rPr>
+                <w:rFonts w:ascii="맑은 고딕" w:cs="맑은 고딕" w:eastAsia="맑은 고딕" w:hAnsi="맑은 고딕"/>
+                <w:b/>
+                <w:bCs/>
+                <w:color w:val="F4CF87"/>
+                <w:sz w:val="17"/>
+                <w:szCs w:val="17"/>
+              </w:rPr>
+              <w:t xml:space="preserve">반영 위치</w:t>
+            </w:r>
+          </w:p>
+        </w:tc>
+        <w:tc>
+          <w:tcPr>
+            <w:tcW w:type="dxa" w:w="7146"/>
+            <w:tcBorders>
+              <w:top w:val="single" w:color="49361D" w:sz="6"/>
+              <w:left w:val="single" w:color="49361D" w:sz="6"/>
+              <w:bottom w:val="single" w:color="49361D" w:sz="6"/>
+              <w:right w:val="single" w:color="49361D" w:sz="6"/>
+            </w:tcBorders>
+            <w:shd w:fill="241B12" w:color="auto" w:val="clear"/>
+            <w:tcMar>
+              <w:top w:type="dxa" w:w="90"/>
+              <w:left w:type="dxa" w:w="110"/>
+              <w:bottom w:type="dxa" w:w="90"/>
+              <w:right w:type="dxa" w:w="110"/>
+            </w:tcMar>
+            <w:vAlign w:val="center"/>
+          </w:tcPr>
+          <w:p>
+            <w:pPr>
+              <w:spacing w:after="0" w:before="0" w:line="260"/>
+            </w:pPr>
+            <w:r>
+              <w:rPr>
+                <w:rFonts w:ascii="맑은 고딕" w:cs="맑은 고딕" w:eastAsia="맑은 고딕" w:hAnsi="맑은 고딕"/>
+                <w:b/>
+                <w:bCs/>
+                <w:color w:val="F4CF87"/>
+                <w:sz w:val="17"/>
+                <w:szCs w:val="17"/>
+              </w:rPr>
+              <w:t xml:space="preserve">내용</w:t>
+            </w:r>
+          </w:p>
+        </w:tc>
+      </w:tr>
+      <w:tr>
+        <w:tc>
+          <w:tcPr>
+            <w:tcW w:type="dxa" w:w="2600"/>
+            <w:tcBorders>
+              <w:top w:val="single" w:color="DEDEDE" w:sz="6"/>
+              <w:left w:val="single" w:color="DEDEDE" w:sz="6"/>
+              <w:bottom w:val="single" w:color="DEDEDE" w:sz="6"/>
+              <w:right w:val="single" w:color="DEDEDE" w:sz="6"/>
+            </w:tcBorders>
+            <w:tcMar>
+              <w:top w:type="dxa" w:w="70"/>
+              <w:left w:type="dxa" w:w="110"/>
+              <w:bottom w:type="dxa" w:w="70"/>
+              <w:right w:type="dxa" w:w="110"/>
+            </w:tcMar>
+            <w:vAlign w:val="center"/>
+          </w:tcPr>
+          <w:p>
+            <w:pPr>
+              <w:spacing w:after="0" w:before="0" w:line="260"/>
+            </w:pPr>
+            <w:r>
+              <w:rPr>
+                <w:rFonts w:ascii="맑은 고딕" w:cs="맑은 고딕" w:eastAsia="맑은 고딕" w:hAnsi="맑은 고딕"/>
+                <w:color w:val="3C3429"/>
+                <w:sz w:val="17"/>
+                <w:szCs w:val="17"/>
+              </w:rPr>
+              <w:t>절차</w:t>
+            </w:r>
+          </w:p>
+        </w:tc>
+        <w:tc>
+          <w:tcPr>
+            <w:tcW w:type="dxa" w:w="7146"/>
+            <w:tcBorders>
+              <w:top w:val="single" w:color="DEDEDE" w:sz="6"/>
+              <w:left w:val="single" w:color="DEDEDE" w:sz="6"/>
+              <w:bottom w:val="single" w:color="DEDEDE" w:sz="6"/>
+              <w:right w:val="single" w:color="DEDEDE" w:sz="6"/>
+            </w:tcBorders>
+            <w:tcMar>
+              <w:top w:type="dxa" w:w="70"/>
+              <w:left w:type="dxa" w:w="110"/>
+              <w:bottom w:type="dxa" w:w="70"/>
+              <w:right w:type="dxa" w:w="110"/>
+            </w:tcMar>
+            <w:vAlign w:val="center"/>
+          </w:tcPr>
+          <w:p>
+            <w:pPr>
+              <w:spacing w:after="0" w:before="0" w:line="260"/>
+            </w:pPr>
+            <w:r>
+              <w:t>새 Nav2 controller, behavior 또는 teleop 경로를 추가할 때 코드만 보고 게이트를 통과할 것이라 추정하지 않고, 최종 /cmd_vel의 실제 Publisher 목록부터 ros2 topic info --verbose로 확인한다. 안전 경로를 변경한 뒤에는 전진·후진·회전 세 방향을 각각 시험한다.</w:t>
+            </w:r>
+          </w:p>
+        </w:tc>
+      </w:tr>
+    </w:tbl>
+    <w:p>
+      <w:pPr>
+        <w:pStyle w:val="Heading2"/>
+        <w:pBdr>
+          <w:left w:val="single" w:color="D9A441" w:sz="24" w:space="8"/>
+        </w:pBdr>
+        <w:spacing w:after="180" w:before="380" w:line="280"/>
+        <w:ind w:left="140"/>
+      </w:pPr>
+      <w:r>
+        <w:rPr>
+          <w:rFonts w:ascii="맑은 고딕" w:cs="맑은 고딕" w:eastAsia="맑은 고딕" w:hAnsi="맑은 고딕"/>
+          <w:b/>
+          <w:bCs/>
+          <w:color w:val="241B12"/>
+          <w:sz w:val="26"/>
+          <w:szCs w:val="26"/>
+        </w:rPr>
+        <w:t>4.4 TS-NAV-04 (launch 조건식에 소문자 불리언 전달로 run.sh 기동 실패)</w:t>
+      </w:r>
+    </w:p>
+    <w:p>
+      <w:pPr>
+        <w:pStyle w:val="Heading3"/>
+        <w:spacing w:after="120" w:before="260" w:line="260"/>
+      </w:pPr>
+      <w:r>
+        <w:rPr>
+          <w:rFonts w:ascii="맑은 고딕" w:cs="맑은 고딕" w:eastAsia="맑은 고딕" w:hAnsi="맑은 고딕"/>
+          <w:b/>
+          <w:bCs/>
+          <w:color w:val="241B12"/>
+          <w:sz w:val="21"/>
+          <w:szCs w:val="21"/>
+        </w:rPr>
+        <w:t xml:space="preserve">개요</w:t>
+      </w:r>
+    </w:p>
+    <w:tbl>
+      <w:tblPr>
+        <w:tblW w:type="dxa" w:w="9746"/>
+        <w:tblBorders>
+          <w:top w:val="single" w:color="DEDEDE" w:sz="6"/>
+          <w:left w:val="single" w:color="DEDEDE" w:sz="6"/>
+          <w:bottom w:val="single" w:color="DEDEDE" w:sz="6"/>
+          <w:right w:val="single" w:color="DEDEDE" w:sz="6"/>
+          <w:insideH w:val="single" w:color="DEDEDE" w:sz="6"/>
+          <w:insideV w:val="single" w:color="DEDEDE" w:sz="6"/>
+        </w:tblBorders>
+      </w:tblPr>
+      <w:tblGrid>
+        <w:gridCol w:w="2600"/>
+        <w:gridCol w:w="7146"/>
+      </w:tblGrid>
+      <w:tr>
+        <w:trPr>
+          <w:tblHeader/>
+        </w:trPr>
+        <w:tc>
+          <w:tcPr>
+            <w:tcW w:type="dxa" w:w="2600"/>
+            <w:tcBorders>
+              <w:top w:val="single" w:color="49361D" w:sz="6"/>
+              <w:left w:val="single" w:color="49361D" w:sz="6"/>
+              <w:bottom w:val="single" w:color="49361D" w:sz="6"/>
+              <w:right w:val="single" w:color="49361D" w:sz="6"/>
+            </w:tcBorders>
+            <w:shd w:fill="241B12" w:color="auto" w:val="clear"/>
+            <w:tcMar>
+              <w:top w:type="dxa" w:w="90"/>
+              <w:left w:type="dxa" w:w="110"/>
+              <w:bottom w:type="dxa" w:w="90"/>
+              <w:right w:type="dxa" w:w="110"/>
+            </w:tcMar>
+            <w:vAlign w:val="center"/>
+          </w:tcPr>
+          <w:p>
+            <w:pPr>
+              <w:spacing w:after="0" w:before="0" w:line="260"/>
+            </w:pPr>
+            <w:r>
+              <w:rPr>
+                <w:rFonts w:ascii="맑은 고딕" w:cs="맑은 고딕" w:eastAsia="맑은 고딕" w:hAnsi="맑은 고딕"/>
+                <w:b/>
+                <w:bCs/>
+                <w:color w:val="F4CF87"/>
+                <w:sz w:val="17"/>
+                <w:szCs w:val="17"/>
+              </w:rPr>
+              <w:t xml:space="preserve">항목</w:t>
+            </w:r>
+          </w:p>
+        </w:tc>
+        <w:tc>
+          <w:tcPr>
+            <w:tcW w:type="dxa" w:w="7146"/>
+            <w:tcBorders>
+              <w:top w:val="single" w:color="49361D" w:sz="6"/>
+              <w:left w:val="single" w:color="49361D" w:sz="6"/>
+              <w:bottom w:val="single" w:color="49361D" w:sz="6"/>
+              <w:right w:val="single" w:color="49361D" w:sz="6"/>
+            </w:tcBorders>
+            <w:shd w:fill="241B12" w:color="auto" w:val="clear"/>
+            <w:tcMar>
+              <w:top w:type="dxa" w:w="90"/>
+              <w:left w:type="dxa" w:w="110"/>
+              <w:bottom w:type="dxa" w:w="90"/>
+              <w:right w:type="dxa" w:w="110"/>
+            </w:tcMar>
+            <w:vAlign w:val="center"/>
+          </w:tcPr>
+          <w:p>
+            <w:pPr>
+              <w:spacing w:after="0" w:before="0" w:line="260"/>
+            </w:pPr>
+            <w:r>
+              <w:rPr>
+                <w:rFonts w:ascii="맑은 고딕" w:cs="맑은 고딕" w:eastAsia="맑은 고딕" w:hAnsi="맑은 고딕"/>
+                <w:b/>
+                <w:bCs/>
+                <w:color w:val="F4CF87"/>
+                <w:sz w:val="17"/>
+                <w:szCs w:val="17"/>
+              </w:rPr>
+              <w:t xml:space="preserve">내용</w:t>
+            </w:r>
+          </w:p>
+        </w:tc>
+      </w:tr>
+      <w:tr>
+        <w:tc>
+          <w:tcPr>
+            <w:tcW w:type="dxa" w:w="2600"/>
+            <w:tcBorders>
+              <w:top w:val="single" w:color="DEDEDE" w:sz="6"/>
+              <w:left w:val="single" w:color="DEDEDE" w:sz="6"/>
+              <w:bottom w:val="single" w:color="DEDEDE" w:sz="6"/>
+              <w:right w:val="single" w:color="DEDEDE" w:sz="6"/>
+            </w:tcBorders>
+            <w:tcMar>
+              <w:top w:type="dxa" w:w="70"/>
+              <w:left w:type="dxa" w:w="110"/>
+              <w:bottom w:type="dxa" w:w="70"/>
+              <w:right w:type="dxa" w:w="110"/>
+            </w:tcMar>
+            <w:vAlign w:val="center"/>
+          </w:tcPr>
+          <w:p>
+            <w:pPr>
+              <w:spacing w:after="0" w:before="0" w:line="260"/>
+            </w:pPr>
+            <w:r>
+              <w:rPr>
+                <w:rFonts w:ascii="맑은 고딕" w:cs="맑은 고딕" w:eastAsia="맑은 고딕" w:hAnsi="맑은 고딕"/>
+                <w:color w:val="3C3429"/>
+                <w:sz w:val="17"/>
+                <w:szCs w:val="17"/>
+              </w:rPr>
+              <w:t xml:space="preserve">심각도 / 상태</w:t>
+            </w:r>
+          </w:p>
+        </w:tc>
+        <w:tc>
+          <w:tcPr>
+            <w:tcW w:type="dxa" w:w="7146"/>
+            <w:tcBorders>
+              <w:top w:val="single" w:color="DEDEDE" w:sz="6"/>
+              <w:left w:val="single" w:color="DEDEDE" w:sz="6"/>
+              <w:bottom w:val="single" w:color="DEDEDE" w:sz="6"/>
+              <w:right w:val="single" w:color="DEDEDE" w:sz="6"/>
+            </w:tcBorders>
+            <w:tcMar>
+              <w:top w:type="dxa" w:w="70"/>
+              <w:left w:type="dxa" w:w="110"/>
+              <w:bottom w:type="dxa" w:w="70"/>
+              <w:right w:type="dxa" w:w="110"/>
+            </w:tcMar>
+            <w:vAlign w:val="center"/>
+          </w:tcPr>
+          <w:p>
+            <w:pPr>
+              <w:spacing w:after="0" w:before="0" w:line="260"/>
+            </w:pPr>
+            <w:r>
+              <w:rPr>
+                <w:rFonts w:ascii="맑은 고딕" w:cs="맑은 고딕" w:eastAsia="맑은 고딕" w:hAnsi="맑은 고딕"/>
+                <w:color w:val="3C3429"/>
+                <w:sz w:val="17"/>
+                <w:szCs w:val="17"/>
+              </w:rPr>
+              <w:t>MAJOR / RESOLVED</w:t>
+            </w:r>
+          </w:p>
+        </w:tc>
+      </w:tr>
+      <w:tr>
+        <w:tc>
+          <w:tcPr>
+            <w:tcW w:type="dxa" w:w="2600"/>
+            <w:tcBorders>
+              <w:top w:val="single" w:color="DEDEDE" w:sz="6"/>
+              <w:left w:val="single" w:color="DEDEDE" w:sz="6"/>
+              <w:bottom w:val="single" w:color="DEDEDE" w:sz="6"/>
+              <w:right w:val="single" w:color="DEDEDE" w:sz="6"/>
+            </w:tcBorders>
+            <w:shd w:fill="FAFAFA" w:color="auto" w:val="clear"/>
+            <w:tcMar>
+              <w:top w:type="dxa" w:w="70"/>
+              <w:left w:type="dxa" w:w="110"/>
+              <w:bottom w:type="dxa" w:w="70"/>
+              <w:right w:type="dxa" w:w="110"/>
+            </w:tcMar>
+            <w:vAlign w:val="center"/>
+          </w:tcPr>
+          <w:p>
+            <w:pPr>
+              <w:spacing w:after="0" w:before="0" w:line="260"/>
+            </w:pPr>
+            <w:r>
+              <w:rPr>
+                <w:rFonts w:ascii="맑은 고딕" w:cs="맑은 고딕" w:eastAsia="맑은 고딕" w:hAnsi="맑은 고딕"/>
+                <w:color w:val="3C3429"/>
+                <w:sz w:val="17"/>
+                <w:szCs w:val="17"/>
+              </w:rPr>
+              <w:t xml:space="preserve">발생일 / 해결일</w:t>
+            </w:r>
+          </w:p>
+        </w:tc>
+        <w:tc>
+          <w:tcPr>
+            <w:tcW w:type="dxa" w:w="7146"/>
+            <w:tcBorders>
+              <w:top w:val="single" w:color="DEDEDE" w:sz="6"/>
+              <w:left w:val="single" w:color="DEDEDE" w:sz="6"/>
+              <w:bottom w:val="single" w:color="DEDEDE" w:sz="6"/>
+              <w:right w:val="single" w:color="DEDEDE" w:sz="6"/>
+            </w:tcBorders>
+            <w:shd w:fill="FAFAFA" w:color="auto" w:val="clear"/>
+            <w:tcMar>
+              <w:top w:type="dxa" w:w="70"/>
+              <w:left w:type="dxa" w:w="110"/>
+              <w:bottom w:type="dxa" w:w="70"/>
+              <w:right w:type="dxa" w:w="110"/>
+            </w:tcMar>
+            <w:vAlign w:val="center"/>
+          </w:tcPr>
+          <w:p>
+            <w:pPr>
+              <w:spacing w:after="0" w:before="0" w:line="260"/>
+            </w:pPr>
+            <w:r>
+              <w:rPr>
+                <w:rFonts w:ascii="맑은 고딕" w:cs="맑은 고딕" w:eastAsia="맑은 고딕" w:hAnsi="맑은 고딕"/>
+                <w:color w:val="3C3429"/>
+                <w:sz w:val="17"/>
+                <w:szCs w:val="17"/>
+              </w:rPr>
+              <w:t>2026-08-18 / 2026-08-18</w:t>
+            </w:r>
+          </w:p>
+        </w:tc>
+      </w:tr>
+      <w:tr>
+        <w:tc>
+          <w:tcPr>
+            <w:tcW w:type="dxa" w:w="2600"/>
+            <w:tcBorders>
+              <w:top w:val="single" w:color="DEDEDE" w:sz="6"/>
+              <w:left w:val="single" w:color="DEDEDE" w:sz="6"/>
+              <w:bottom w:val="single" w:color="DEDEDE" w:sz="6"/>
+              <w:right w:val="single" w:color="DEDEDE" w:sz="6"/>
+            </w:tcBorders>
+            <w:tcMar>
+              <w:top w:type="dxa" w:w="70"/>
+              <w:left w:type="dxa" w:w="110"/>
+              <w:bottom w:type="dxa" w:w="70"/>
+              <w:right w:type="dxa" w:w="110"/>
+            </w:tcMar>
+            <w:vAlign w:val="center"/>
+          </w:tcPr>
+          <w:p>
+            <w:pPr>
+              <w:spacing w:after="0" w:before="0" w:line="260"/>
+            </w:pPr>
+            <w:r>
+              <w:rPr>
+                <w:rFonts w:ascii="맑은 고딕" w:cs="맑은 고딕" w:eastAsia="맑은 고딕" w:hAnsi="맑은 고딕"/>
+                <w:color w:val="3C3429"/>
+                <w:sz w:val="17"/>
+                <w:szCs w:val="17"/>
+              </w:rPr>
+              <w:t xml:space="preserve">담당</w:t>
+            </w:r>
+          </w:p>
+        </w:tc>
+        <w:tc>
+          <w:tcPr>
+            <w:tcW w:type="dxa" w:w="7146"/>
+            <w:tcBorders>
+              <w:top w:val="single" w:color="DEDEDE" w:sz="6"/>
+              <w:left w:val="single" w:color="DEDEDE" w:sz="6"/>
+              <w:bottom w:val="single" w:color="DEDEDE" w:sz="6"/>
+              <w:right w:val="single" w:color="DEDEDE" w:sz="6"/>
+            </w:tcBorders>
+            <w:tcMar>
+              <w:top w:type="dxa" w:w="70"/>
+              <w:left w:type="dxa" w:w="110"/>
+              <w:bottom w:type="dxa" w:w="70"/>
+              <w:right w:type="dxa" w:w="110"/>
+            </w:tcMar>
+            <w:vAlign w:val="center"/>
+          </w:tcPr>
+          <w:p>
+            <w:pPr>
+              <w:spacing w:after="0" w:before="0" w:line="260"/>
+            </w:pPr>
+            <w:r>
+              <w:rPr>
+                <w:rFonts w:ascii="맑은 고딕" w:cs="맑은 고딕" w:eastAsia="맑은 고딕" w:hAnsi="맑은 고딕"/>
+                <w:color w:val="3C3429"/>
+                <w:sz w:val="17"/>
+                <w:szCs w:val="17"/>
+              </w:rPr>
+              <w:t>미지정</w:t>
+            </w:r>
+          </w:p>
+        </w:tc>
+      </w:tr>
+      <w:tr>
+        <w:tc>
+          <w:tcPr>
+            <w:tcW w:type="dxa" w:w="2600"/>
+            <w:tcBorders>
+              <w:top w:val="single" w:color="DEDEDE" w:sz="6"/>
+              <w:left w:val="single" w:color="DEDEDE" w:sz="6"/>
+              <w:bottom w:val="single" w:color="DEDEDE" w:sz="6"/>
+              <w:right w:val="single" w:color="DEDEDE" w:sz="6"/>
+            </w:tcBorders>
+            <w:shd w:fill="FAFAFA" w:color="auto" w:val="clear"/>
+            <w:tcMar>
+              <w:top w:type="dxa" w:w="70"/>
+              <w:left w:type="dxa" w:w="110"/>
+              <w:bottom w:type="dxa" w:w="70"/>
+              <w:right w:type="dxa" w:w="110"/>
+            </w:tcMar>
+            <w:vAlign w:val="center"/>
+          </w:tcPr>
+          <w:p>
+            <w:pPr>
+              <w:spacing w:after="0" w:before="0" w:line="260"/>
+            </w:pPr>
+            <w:r>
+              <w:rPr>
+                <w:rFonts w:ascii="맑은 고딕" w:cs="맑은 고딕" w:eastAsia="맑은 고딕" w:hAnsi="맑은 고딕"/>
+                <w:color w:val="3C3429"/>
+                <w:sz w:val="17"/>
+                <w:szCs w:val="17"/>
+              </w:rPr>
+              <w:t xml:space="preserve">환경</w:t>
+            </w:r>
+          </w:p>
+        </w:tc>
+        <w:tc>
+          <w:tcPr>
+            <w:tcW w:type="dxa" w:w="7146"/>
+            <w:tcBorders>
+              <w:top w:val="single" w:color="DEDEDE" w:sz="6"/>
+              <w:left w:val="single" w:color="DEDEDE" w:sz="6"/>
+              <w:bottom w:val="single" w:color="DEDEDE" w:sz="6"/>
+              <w:right w:val="single" w:color="DEDEDE" w:sz="6"/>
+            </w:tcBorders>
+            <w:shd w:fill="FAFAFA" w:color="auto" w:val="clear"/>
+            <w:tcMar>
+              <w:top w:type="dxa" w:w="70"/>
+              <w:left w:type="dxa" w:w="110"/>
+              <w:bottom w:type="dxa" w:w="70"/>
+              <w:right w:type="dxa" w:w="110"/>
+            </w:tcMar>
+            <w:vAlign w:val="center"/>
+          </w:tcPr>
+          <w:p>
+            <w:pPr>
+              <w:spacing w:after="0" w:before="0" w:line="260"/>
+            </w:pPr>
+            <w:r>
+              <w:rPr>
+                <w:rFonts w:ascii="맑은 고딕" w:cs="맑은 고딕" w:eastAsia="맑은 고딕" w:hAnsi="맑은 고딕"/>
+                <w:color w:val="3C3429"/>
+                <w:sz w:val="17"/>
+                <w:szCs w:val="17"/>
+              </w:rPr>
+              <w:t>ROS 2 Humble · Nav2 launch(PythonExpression 조건식) · medirun_bringup</w:t>
+            </w:r>
+          </w:p>
+        </w:tc>
+      </w:tr>
+      <w:tr>
+        <w:tc>
+          <w:tcPr>
+            <w:tcW w:type="dxa" w:w="2600"/>
+            <w:tcBorders>
+              <w:top w:val="single" w:color="DEDEDE" w:sz="6"/>
+              <w:left w:val="single" w:color="DEDEDE" w:sz="6"/>
+              <w:bottom w:val="single" w:color="DEDEDE" w:sz="6"/>
+              <w:right w:val="single" w:color="DEDEDE" w:sz="6"/>
+            </w:tcBorders>
+            <w:tcMar>
+              <w:top w:type="dxa" w:w="70"/>
+              <w:left w:type="dxa" w:w="110"/>
+              <w:bottom w:type="dxa" w:w="70"/>
+              <w:right w:type="dxa" w:w="110"/>
+            </w:tcMar>
+            <w:vAlign w:val="center"/>
+          </w:tcPr>
+          <w:p>
+            <w:pPr>
+              <w:spacing w:after="0" w:before="0" w:line="260"/>
+            </w:pPr>
+            <w:r>
+              <w:rPr>
+                <w:rFonts w:ascii="맑은 고딕" w:cs="맑은 고딕" w:eastAsia="맑은 고딕" w:hAnsi="맑은 고딕"/>
+                <w:color w:val="3C3429"/>
+                <w:sz w:val="17"/>
+                <w:szCs w:val="17"/>
+              </w:rPr>
+              <w:t xml:space="preserve">관련</w:t>
+            </w:r>
+          </w:p>
+        </w:tc>
+        <w:tc>
+          <w:tcPr>
+            <w:tcW w:type="dxa" w:w="7146"/>
+            <w:tcBorders>
+              <w:top w:val="single" w:color="DEDEDE" w:sz="6"/>
+              <w:left w:val="single" w:color="DEDEDE" w:sz="6"/>
+              <w:bottom w:val="single" w:color="DEDEDE" w:sz="6"/>
+              <w:right w:val="single" w:color="DEDEDE" w:sz="6"/>
+            </w:tcBorders>
+            <w:tcMar>
+              <w:top w:type="dxa" w:w="70"/>
+              <w:left w:type="dxa" w:w="110"/>
+              <w:bottom w:type="dxa" w:w="70"/>
+              <w:right w:type="dxa" w:w="110"/>
+            </w:tcMar>
+            <w:vAlign w:val="center"/>
+          </w:tcPr>
+          <w:p>
+            <w:pPr>
+              <w:spacing w:after="0" w:before="0" w:line="260"/>
+            </w:pPr>
+            <w:r>
+              <w:rPr>
+                <w:rFonts w:ascii="맑은 고딕" w:cs="맑은 고딕" w:eastAsia="맑은 고딕" w:hAnsi="맑은 고딕"/>
+                <w:color w:val="3C3429"/>
+                <w:sz w:val="17"/>
+                <w:szCs w:val="17"/>
+              </w:rPr>
+              <w:t>TS-NAV-03(같은 세션, 안전 게이트 수정 직후 발견)</w:t>
+            </w:r>
+          </w:p>
+        </w:tc>
+      </w:tr>
+    </w:tbl>
+    <w:p>
+      <w:pPr>
+        <w:pStyle w:val="Heading3"/>
+        <w:spacing w:after="120" w:before="260" w:line="260"/>
+      </w:pPr>
+      <w:r>
+        <w:rPr>
+          <w:rFonts w:ascii="맑은 고딕" w:cs="맑은 고딕" w:eastAsia="맑은 고딕" w:hAnsi="맑은 고딕"/>
+          <w:b/>
+          <w:bCs/>
+          <w:color w:val="241B12"/>
+          <w:sz w:val="21"/>
+          <w:szCs w:val="21"/>
+        </w:rPr>
+        <w:t xml:space="preserve">증상</w:t>
+      </w:r>
+    </w:p>
+    <w:p>
+      <w:pPr>
+        <w:spacing w:after="140" w:before="0" w:line="260"/>
+      </w:pPr>
+      <w:r>
+        <w:rPr>
+          <w:rFonts w:ascii="맑은 고딕" w:cs="맑은 고딕" w:eastAsia="맑은 고딕" w:hAnsi="맑은 고딕"/>
+          <w:color w:val="3C3429"/>
+          <w:sz w:val="17"/>
+          <w:szCs w:val="17"/>
+        </w:rPr>
+        <w:t>TS-NAV-03 조치를 반영한 뒤 ./scripts/run.sh를 실행하면 launch가 기동 직후 종료되고 콘솔에 name 'true' is not defined 오류가 출력됐다.</w:t>
+      </w:r>
+    </w:p>
+    <w:tbl>
+      <w:tblPr>
+        <w:tblW w:type="dxa" w:w="9746"/>
+        <w:tblBorders>
+          <w:top w:val="single" w:color="DEDEDE" w:sz="6"/>
+          <w:left w:val="single" w:color="DEDEDE" w:sz="6"/>
+          <w:bottom w:val="single" w:color="DEDEDE" w:sz="6"/>
+          <w:right w:val="single" w:color="DEDEDE" w:sz="6"/>
+          <w:insideH w:val="single" w:color="DEDEDE" w:sz="6"/>
+          <w:insideV w:val="single" w:color="DEDEDE" w:sz="6"/>
+        </w:tblBorders>
+      </w:tblPr>
+      <w:tblGrid>
+        <w:gridCol w:w="9746"/>
+      </w:tblGrid>
+      <w:tr>
+        <w:tc>
+          <w:tcPr>
+            <w:tcW w:type="dxa" w:w="9746"/>
+            <w:tcBorders>
+              <w:top w:val="single" w:color="DEDEDE" w:sz="6"/>
+              <w:left w:val="single" w:color="DEDEDE" w:sz="6"/>
+              <w:bottom w:val="single" w:color="DEDEDE" w:sz="6"/>
+              <w:right w:val="single" w:color="DEDEDE" w:sz="6"/>
+            </w:tcBorders>
+            <w:shd w:fill="F7F8FA" w:color="auto" w:val="clear"/>
+            <w:tcMar>
+              <w:top w:type="dxa" w:w="140"/>
+              <w:left w:type="dxa" w:w="160"/>
+              <w:bottom w:type="dxa" w:w="140"/>
+              <w:right w:type="dxa" w:w="160"/>
+            </w:tcMar>
+          </w:tcPr>
+          <w:p>
+            <w:pPr>
+              <w:spacing w:after="20" w:line="240"/>
+            </w:pPr>
+            <w:r>
+              <w:rPr>
+                <w:rFonts w:ascii="Consolas" w:cs="Consolas" w:eastAsia="Consolas" w:hAnsi="Consolas"/>
+                <w:color w:val="3C3429"/>
+                <w:sz w:val="16"/>
+                <w:szCs w:val="16"/>
+              </w:rPr>
+              <w:t>$ ./scripts/run.sh (조치 전)</w:t>
+              <w:br/>
+              <w:t>name 'true' is not defined</w:t>
+            </w:r>
+          </w:p>
+        </w:tc>
+      </w:tr>
+    </w:tbl>
+    <w:p>
+      <w:pPr>
+        <w:pStyle w:val="Heading3"/>
+        <w:spacing w:after="120" w:before="260" w:line="260"/>
+      </w:pPr>
+      <w:r>
+        <w:rPr>
+          <w:rFonts w:ascii="맑은 고딕" w:cs="맑은 고딕" w:eastAsia="맑은 고딕" w:hAnsi="맑은 고딕"/>
+          <w:b/>
+          <w:bCs/>
+          <w:color w:val="241B12"/>
+          <w:sz w:val="21"/>
+          <w:szCs w:val="21"/>
+        </w:rPr>
+        <w:t xml:space="preserve">재현 절차</w:t>
+      </w:r>
+    </w:p>
+    <w:tbl>
+      <w:tblPr>
+        <w:tblW w:type="dxa" w:w="9746"/>
+        <w:tblBorders>
+          <w:top w:val="single" w:color="DEDEDE" w:sz="6"/>
+          <w:left w:val="single" w:color="DEDEDE" w:sz="6"/>
+          <w:bottom w:val="single" w:color="DEDEDE" w:sz="6"/>
+          <w:right w:val="single" w:color="DEDEDE" w:sz="6"/>
+          <w:insideH w:val="single" w:color="DEDEDE" w:sz="6"/>
+          <w:insideV w:val="single" w:color="DEDEDE" w:sz="6"/>
+        </w:tblBorders>
+      </w:tblPr>
+      <w:tblGrid>
+        <w:gridCol w:w="1500"/>
+        <w:gridCol w:w="3000"/>
+        <w:gridCol w:w="5246"/>
+      </w:tblGrid>
+      <w:tr>
+        <w:trPr>
+          <w:tblHeader/>
+        </w:trPr>
+        <w:tc>
+          <w:tcPr>
+            <w:tcW w:type="dxa" w:w="1500"/>
+            <w:tcBorders>
+              <w:top w:val="single" w:color="49361D" w:sz="6"/>
+              <w:left w:val="single" w:color="49361D" w:sz="6"/>
+              <w:bottom w:val="single" w:color="49361D" w:sz="6"/>
+              <w:right w:val="single" w:color="49361D" w:sz="6"/>
+            </w:tcBorders>
+            <w:shd w:fill="241B12" w:color="auto" w:val="clear"/>
+            <w:tcMar>
+              <w:top w:type="dxa" w:w="90"/>
+              <w:left w:type="dxa" w:w="110"/>
+              <w:bottom w:type="dxa" w:w="90"/>
+              <w:right w:type="dxa" w:w="110"/>
+            </w:tcMar>
+            <w:vAlign w:val="center"/>
+          </w:tcPr>
+          <w:p>
+            <w:pPr>
+              <w:spacing w:after="0" w:before="0" w:line="260"/>
+            </w:pPr>
+            <w:r>
+              <w:rPr>
+                <w:rFonts w:ascii="맑은 고딕" w:cs="맑은 고딕" w:eastAsia="맑은 고딕" w:hAnsi="맑은 고딕"/>
+                <w:b/>
+                <w:bCs/>
+                <w:color w:val="F4CF87"/>
+                <w:sz w:val="17"/>
+                <w:szCs w:val="17"/>
+              </w:rPr>
+              <w:t xml:space="preserve">#</w:t>
+            </w:r>
+          </w:p>
+        </w:tc>
+        <w:tc>
+          <w:tcPr>
+            <w:tcW w:type="dxa" w:w="3000"/>
+            <w:tcBorders>
+              <w:top w:val="single" w:color="49361D" w:sz="6"/>
+              <w:left w:val="single" w:color="49361D" w:sz="6"/>
+              <w:bottom w:val="single" w:color="49361D" w:sz="6"/>
+              <w:right w:val="single" w:color="49361D" w:sz="6"/>
+            </w:tcBorders>
+            <w:shd w:fill="241B12" w:color="auto" w:val="clear"/>
+            <w:tcMar>
+              <w:top w:type="dxa" w:w="90"/>
+              <w:left w:type="dxa" w:w="110"/>
+              <w:bottom w:type="dxa" w:w="90"/>
+              <w:right w:type="dxa" w:w="110"/>
+            </w:tcMar>
+            <w:vAlign w:val="center"/>
+          </w:tcPr>
+          <w:p>
+            <w:pPr>
+              <w:spacing w:after="0" w:before="0" w:line="260"/>
+            </w:pPr>
+            <w:r>
+              <w:rPr>
+                <w:rFonts w:ascii="맑은 고딕" w:cs="맑은 고딕" w:eastAsia="맑은 고딕" w:hAnsi="맑은 고딕"/>
+                <w:b/>
+                <w:bCs/>
+                <w:color w:val="F4CF87"/>
+                <w:sz w:val="17"/>
+                <w:szCs w:val="17"/>
+              </w:rPr>
+              <w:t xml:space="preserve">동작</w:t>
+            </w:r>
+          </w:p>
+        </w:tc>
+        <w:tc>
+          <w:tcPr>
+            <w:tcW w:type="dxa" w:w="5246"/>
+            <w:tcBorders>
+              <w:top w:val="single" w:color="49361D" w:sz="6"/>
+              <w:left w:val="single" w:color="49361D" w:sz="6"/>
+              <w:bottom w:val="single" w:color="49361D" w:sz="6"/>
+              <w:right w:val="single" w:color="49361D" w:sz="6"/>
+            </w:tcBorders>
+            <w:shd w:fill="241B12" w:color="auto" w:val="clear"/>
+            <w:tcMar>
+              <w:top w:type="dxa" w:w="90"/>
+              <w:left w:type="dxa" w:w="110"/>
+              <w:bottom w:type="dxa" w:w="90"/>
+              <w:right w:type="dxa" w:w="110"/>
+            </w:tcMar>
+            <w:vAlign w:val="center"/>
+          </w:tcPr>
+          <w:p>
+            <w:pPr>
+              <w:spacing w:after="0" w:before="0" w:line="260"/>
+            </w:pPr>
+            <w:r>
+              <w:rPr>
+                <w:rFonts w:ascii="맑은 고딕" w:cs="맑은 고딕" w:eastAsia="맑은 고딕" w:hAnsi="맑은 고딕"/>
+                <w:b/>
+                <w:bCs/>
+                <w:color w:val="F4CF87"/>
+                <w:sz w:val="17"/>
+                <w:szCs w:val="17"/>
+              </w:rPr>
+              <w:t xml:space="preserve">결과</w:t>
+            </w:r>
+          </w:p>
+        </w:tc>
+      </w:tr>
+      <w:tr>
+        <w:tc>
+          <w:tcPr>
+            <w:tcW w:type="dxa" w:w="1500"/>
+            <w:tcBorders>
+              <w:top w:val="single" w:color="DEDEDE" w:sz="6"/>
+              <w:left w:val="single" w:color="DEDEDE" w:sz="6"/>
+              <w:bottom w:val="single" w:color="DEDEDE" w:sz="6"/>
+              <w:right w:val="single" w:color="DEDEDE" w:sz="6"/>
+            </w:tcBorders>
+            <w:tcMar>
+              <w:top w:type="dxa" w:w="70"/>
+              <w:left w:type="dxa" w:w="110"/>
+              <w:bottom w:type="dxa" w:w="70"/>
+              <w:right w:type="dxa" w:w="110"/>
+            </w:tcMar>
+            <w:vAlign w:val="center"/>
+          </w:tcPr>
+          <w:p>
+            <w:pPr>
+              <w:spacing w:after="0" w:before="0" w:line="260"/>
+            </w:pPr>
+            <w:r>
+              <w:rPr>
+                <w:rFonts w:ascii="맑은 고딕" w:cs="맑은 고딕" w:eastAsia="맑은 고딕" w:hAnsi="맑은 고딕"/>
+                <w:color w:val="3C3429"/>
+                <w:sz w:val="17"/>
+                <w:szCs w:val="17"/>
+              </w:rPr>
+              <w:t>1</w:t>
+            </w:r>
+          </w:p>
+        </w:tc>
+        <w:tc>
+          <w:tcPr>
+            <w:tcW w:type="dxa" w:w="3000"/>
+            <w:tcBorders>
+              <w:top w:val="single" w:color="DEDEDE" w:sz="6"/>
+              <w:left w:val="single" w:color="DEDEDE" w:sz="6"/>
+              <w:bottom w:val="single" w:color="DEDEDE" w:sz="6"/>
+              <w:right w:val="single" w:color="DEDEDE" w:sz="6"/>
+            </w:tcBorders>
+            <w:tcMar>
+              <w:top w:type="dxa" w:w="70"/>
+              <w:left w:type="dxa" w:w="110"/>
+              <w:bottom w:type="dxa" w:w="70"/>
+              <w:right w:type="dxa" w:w="110"/>
+            </w:tcMar>
+            <w:vAlign w:val="center"/>
+          </w:tcPr>
+          <w:p>
+            <w:pPr>
+              <w:spacing w:after="0" w:before="0" w:line="260"/>
+            </w:pPr>
+            <w:r>
+              <w:t>navigation_safety.launch.py 반영 후 ./scripts/run.sh를 실행한다</w:t>
+            </w:r>
+          </w:p>
+        </w:tc>
+        <w:tc>
+          <w:tcPr>
+            <w:tcW w:type="dxa" w:w="5246"/>
+            <w:tcBorders>
+              <w:top w:val="single" w:color="DEDEDE" w:sz="6"/>
+              <w:left w:val="single" w:color="DEDEDE" w:sz="6"/>
+              <w:bottom w:val="single" w:color="DEDEDE" w:sz="6"/>
+              <w:right w:val="single" w:color="DEDEDE" w:sz="6"/>
+            </w:tcBorders>
+            <w:tcMar>
+              <w:top w:type="dxa" w:w="70"/>
+              <w:left w:type="dxa" w:w="110"/>
+              <w:bottom w:type="dxa" w:w="70"/>
+              <w:right w:type="dxa" w:w="110"/>
+            </w:tcMar>
+            <w:vAlign w:val="center"/>
+          </w:tcPr>
+          <w:p>
+            <w:pPr>
+              <w:spacing w:after="0" w:before="0" w:line="260"/>
+            </w:pPr>
+            <w:r>
+              <w:t>launch가 기동 직후 종료된다</w:t>
+            </w:r>
+          </w:p>
+        </w:tc>
+      </w:tr>
+      <w:tr>
+        <w:tc>
+          <w:tcPr>
+            <w:tcW w:type="dxa" w:w="1500"/>
+            <w:tcBorders>
+              <w:top w:val="single" w:color="DEDEDE" w:sz="6"/>
+              <w:left w:val="single" w:color="DEDEDE" w:sz="6"/>
+              <w:bottom w:val="single" w:color="DEDEDE" w:sz="6"/>
+              <w:right w:val="single" w:color="DEDEDE" w:sz="6"/>
+            </w:tcBorders>
+            <w:shd w:fill="FAFAFA" w:color="auto" w:val="clear"/>
+            <w:tcMar>
+              <w:top w:type="dxa" w:w="70"/>
+              <w:left w:type="dxa" w:w="110"/>
+              <w:bottom w:type="dxa" w:w="70"/>
+              <w:right w:type="dxa" w:w="110"/>
+            </w:tcMar>
+            <w:vAlign w:val="center"/>
+          </w:tcPr>
+          <w:p>
+            <w:pPr>
+              <w:spacing w:after="0" w:before="0" w:line="260"/>
+            </w:pPr>
+            <w:r>
+              <w:rPr>
+                <w:rFonts w:ascii="맑은 고딕" w:cs="맑은 고딕" w:eastAsia="맑은 고딕" w:hAnsi="맑은 고딕"/>
+                <w:color w:val="3C3429"/>
+                <w:sz w:val="17"/>
+                <w:szCs w:val="17"/>
+              </w:rPr>
+              <w:t>2</w:t>
+            </w:r>
+          </w:p>
+        </w:tc>
+        <w:tc>
+          <w:tcPr>
+            <w:tcW w:type="dxa" w:w="3000"/>
+            <w:tcBorders>
+              <w:top w:val="single" w:color="DEDEDE" w:sz="6"/>
+              <w:left w:val="single" w:color="DEDEDE" w:sz="6"/>
+              <w:bottom w:val="single" w:color="DEDEDE" w:sz="6"/>
+              <w:right w:val="single" w:color="DEDEDE" w:sz="6"/>
+            </w:tcBorders>
+            <w:shd w:fill="FAFAFA" w:color="auto" w:val="clear"/>
+            <w:tcMar>
+              <w:top w:type="dxa" w:w="70"/>
+              <w:left w:type="dxa" w:w="110"/>
+              <w:bottom w:type="dxa" w:w="70"/>
+              <w:right w:type="dxa" w:w="110"/>
+            </w:tcMar>
+            <w:vAlign w:val="center"/>
+          </w:tcPr>
+          <w:p>
+            <w:pPr>
+              <w:spacing w:after="0" w:before="0" w:line="260"/>
+            </w:pPr>
+            <w:r>
+              <w:t>콘솔 출력을 확인한다</w:t>
+            </w:r>
+          </w:p>
+        </w:tc>
+        <w:tc>
+          <w:tcPr>
+            <w:tcW w:type="dxa" w:w="5246"/>
+            <w:tcBorders>
+              <w:top w:val="single" w:color="DEDEDE" w:sz="6"/>
+              <w:left w:val="single" w:color="DEDEDE" w:sz="6"/>
+              <w:bottom w:val="single" w:color="DEDEDE" w:sz="6"/>
+              <w:right w:val="single" w:color="DEDEDE" w:sz="6"/>
+            </w:tcBorders>
+            <w:shd w:fill="FAFAFA" w:color="auto" w:val="clear"/>
+            <w:tcMar>
+              <w:top w:type="dxa" w:w="70"/>
+              <w:left w:type="dxa" w:w="110"/>
+              <w:bottom w:type="dxa" w:w="70"/>
+              <w:right w:type="dxa" w:w="110"/>
+            </w:tcMar>
+            <w:vAlign w:val="center"/>
+          </w:tcPr>
+          <w:p>
+            <w:pPr>
+              <w:spacing w:after="0" w:before="0" w:line="260"/>
+            </w:pPr>
+            <w:r>
+              <w:t>name 'true' is not defined 오류가 출력된다</w:t>
+            </w:r>
+          </w:p>
+        </w:tc>
+      </w:tr>
+      <w:tr>
+        <w:tc>
+          <w:tcPr>
+            <w:tcW w:type="dxa" w:w="1500"/>
+            <w:tcBorders>
+              <w:top w:val="single" w:color="DEDEDE" w:sz="6"/>
+              <w:left w:val="single" w:color="DEDEDE" w:sz="6"/>
+              <w:bottom w:val="single" w:color="DEDEDE" w:sz="6"/>
+              <w:right w:val="single" w:color="DEDEDE" w:sz="6"/>
+            </w:tcBorders>
+            <w:tcMar>
+              <w:top w:type="dxa" w:w="70"/>
+              <w:left w:type="dxa" w:w="110"/>
+              <w:bottom w:type="dxa" w:w="70"/>
+              <w:right w:type="dxa" w:w="110"/>
+            </w:tcMar>
+            <w:vAlign w:val="center"/>
+          </w:tcPr>
+          <w:p>
+            <w:pPr>
+              <w:spacing w:after="0" w:before="0" w:line="260"/>
+            </w:pPr>
+            <w:r>
+              <w:rPr>
+                <w:rFonts w:ascii="맑은 고딕" w:cs="맑은 고딕" w:eastAsia="맑은 고딕" w:hAnsi="맑은 고딕"/>
+                <w:color w:val="3C3429"/>
+                <w:sz w:val="17"/>
+                <w:szCs w:val="17"/>
+              </w:rPr>
+              <w:t>3</w:t>
+            </w:r>
+          </w:p>
+        </w:tc>
+        <w:tc>
+          <w:tcPr>
+            <w:tcW w:type="dxa" w:w="3000"/>
+            <w:tcBorders>
+              <w:top w:val="single" w:color="DEDEDE" w:sz="6"/>
+              <w:left w:val="single" w:color="DEDEDE" w:sz="6"/>
+              <w:bottom w:val="single" w:color="DEDEDE" w:sz="6"/>
+              <w:right w:val="single" w:color="DEDEDE" w:sz="6"/>
+            </w:tcBorders>
+            <w:tcMar>
+              <w:top w:type="dxa" w:w="70"/>
+              <w:left w:type="dxa" w:w="110"/>
+              <w:bottom w:type="dxa" w:w="70"/>
+              <w:right w:type="dxa" w:w="110"/>
+            </w:tcMar>
+            <w:vAlign w:val="center"/>
+          </w:tcPr>
+          <w:p>
+            <w:pPr>
+              <w:spacing w:after="0" w:before="0" w:line="260"/>
+            </w:pPr>
+            <w:r>
+              <w:t>bringup.launch.py의 use_composition 조건 처리 부분과 Nav2 include 내부 PythonExpression을 확인한다</w:t>
+            </w:r>
+          </w:p>
+        </w:tc>
+        <w:tc>
+          <w:tcPr>
+            <w:tcW w:type="dxa" w:w="5246"/>
+            <w:tcBorders>
+              <w:top w:val="single" w:color="DEDEDE" w:sz="6"/>
+              <w:left w:val="single" w:color="DEDEDE" w:sz="6"/>
+              <w:bottom w:val="single" w:color="DEDEDE" w:sz="6"/>
+              <w:right w:val="single" w:color="DEDEDE" w:sz="6"/>
+            </w:tcBorders>
+            <w:tcMar>
+              <w:top w:type="dxa" w:w="70"/>
+              <w:left w:type="dxa" w:w="110"/>
+              <w:bottom w:type="dxa" w:w="70"/>
+              <w:right w:type="dxa" w:w="110"/>
+            </w:tcMar>
+            <w:vAlign w:val="center"/>
+          </w:tcPr>
+          <w:p>
+            <w:pPr>
+              <w:spacing w:after="0" w:before="0" w:line="260"/>
+            </w:pPr>
+            <w:r>
+              <w:t>PythonExpression(["not ", use_composition])이 소문자 문자열 "true"를 정의되지 않은 변수명으로 평가하고 있음을 확인</w:t>
+            </w:r>
+          </w:p>
+        </w:tc>
+      </w:tr>
+    </w:tbl>
+    <w:p>
+      <w:pPr>
+        <w:spacing w:after="140" w:before="0" w:line="260"/>
+      </w:pPr>
+      <w:r>
+        <w:rPr>
+          <w:rFonts w:ascii="맑은 고딕" w:cs="맑은 고딕" w:eastAsia="맑은 고딕" w:hAnsi="맑은 고딕"/>
+          <w:color w:val="3C3429"/>
+          <w:sz w:val="17"/>
+          <w:szCs w:val="17"/>
+        </w:rPr>
+        <w:t>재현율: 3/3회 (원인 확인 전까지 항상 재현)</w:t>
+      </w:r>
+    </w:p>
+    <w:p>
+      <w:pPr>
+        <w:pStyle w:val="Heading3"/>
+        <w:spacing w:after="120" w:before="260" w:line="260"/>
+      </w:pPr>
+      <w:r>
+        <w:rPr>
+          <w:rFonts w:ascii="맑은 고딕" w:cs="맑은 고딕" w:eastAsia="맑은 고딕" w:hAnsi="맑은 고딕"/>
+          <w:b/>
+          <w:bCs/>
+          <w:color w:val="241B12"/>
+          <w:sz w:val="21"/>
+          <w:szCs w:val="21"/>
+        </w:rPr>
+        <w:t xml:space="preserve">진단 과정</w:t>
+      </w:r>
+    </w:p>
+    <w:tbl>
+      <w:tblPr>
+        <w:tblW w:type="dxa" w:w="9746"/>
+        <w:tblBorders>
+          <w:top w:val="single" w:color="DEDEDE" w:sz="6"/>
+          <w:left w:val="single" w:color="DEDEDE" w:sz="6"/>
+          <w:bottom w:val="single" w:color="DEDEDE" w:sz="6"/>
+          <w:right w:val="single" w:color="DEDEDE" w:sz="6"/>
+          <w:insideH w:val="single" w:color="DEDEDE" w:sz="6"/>
+          <w:insideV w:val="single" w:color="DEDEDE" w:sz="6"/>
+        </w:tblBorders>
+      </w:tblPr>
+      <w:tblGrid>
+        <w:gridCol w:w="1500"/>
+        <w:gridCol w:w="3000"/>
+        <w:gridCol w:w="5246"/>
+      </w:tblGrid>
+      <w:tr>
+        <w:trPr>
+          <w:tblHeader/>
+        </w:trPr>
+        <w:tc>
+          <w:tcPr>
+            <w:tcW w:type="dxa" w:w="1500"/>
+            <w:tcBorders>
+              <w:top w:val="single" w:color="49361D" w:sz="6"/>
+              <w:left w:val="single" w:color="49361D" w:sz="6"/>
+              <w:bottom w:val="single" w:color="49361D" w:sz="6"/>
+              <w:right w:val="single" w:color="49361D" w:sz="6"/>
+            </w:tcBorders>
+            <w:shd w:fill="241B12" w:color="auto" w:val="clear"/>
+            <w:tcMar>
+              <w:top w:type="dxa" w:w="90"/>
+              <w:left w:type="dxa" w:w="110"/>
+              <w:bottom w:type="dxa" w:w="90"/>
+              <w:right w:type="dxa" w:w="110"/>
+            </w:tcMar>
+            <w:vAlign w:val="center"/>
+          </w:tcPr>
+          <w:p>
+            <w:pPr>
+              <w:spacing w:after="0" w:before="0" w:line="260"/>
+            </w:pPr>
+            <w:r>
+              <w:rPr>
+                <w:rFonts w:ascii="맑은 고딕" w:cs="맑은 고딕" w:eastAsia="맑은 고딕" w:hAnsi="맑은 고딕"/>
+                <w:b/>
+                <w:bCs/>
+                <w:color w:val="F4CF87"/>
+                <w:sz w:val="17"/>
+                <w:szCs w:val="17"/>
+              </w:rPr>
+              <w:t xml:space="preserve">가설</w:t>
+            </w:r>
+          </w:p>
+        </w:tc>
+        <w:tc>
+          <w:tcPr>
+            <w:tcW w:type="dxa" w:w="3000"/>
+            <w:tcBorders>
+              <w:top w:val="single" w:color="49361D" w:sz="6"/>
+              <w:left w:val="single" w:color="49361D" w:sz="6"/>
+              <w:bottom w:val="single" w:color="49361D" w:sz="6"/>
+              <w:right w:val="single" w:color="49361D" w:sz="6"/>
+            </w:tcBorders>
+            <w:shd w:fill="241B12" w:color="auto" w:val="clear"/>
+            <w:tcMar>
+              <w:top w:type="dxa" w:w="90"/>
+              <w:left w:type="dxa" w:w="110"/>
+              <w:bottom w:type="dxa" w:w="90"/>
+              <w:right w:type="dxa" w:w="110"/>
+            </w:tcMar>
+            <w:vAlign w:val="center"/>
+          </w:tcPr>
+          <w:p>
+            <w:pPr>
+              <w:spacing w:after="0" w:before="0" w:line="260"/>
+            </w:pPr>
+            <w:r>
+              <w:rPr>
+                <w:rFonts w:ascii="맑은 고딕" w:cs="맑은 고딕" w:eastAsia="맑은 고딕" w:hAnsi="맑은 고딕"/>
+                <w:b/>
+                <w:bCs/>
+                <w:color w:val="F4CF87"/>
+                <w:sz w:val="17"/>
+                <w:szCs w:val="17"/>
+              </w:rPr>
+              <w:t xml:space="preserve">확인 방법</w:t>
+            </w:r>
+          </w:p>
+        </w:tc>
+        <w:tc>
+          <w:tcPr>
+            <w:tcW w:type="dxa" w:w="5246"/>
+            <w:tcBorders>
+              <w:top w:val="single" w:color="49361D" w:sz="6"/>
+              <w:left w:val="single" w:color="49361D" w:sz="6"/>
+              <w:bottom w:val="single" w:color="49361D" w:sz="6"/>
+              <w:right w:val="single" w:color="49361D" w:sz="6"/>
+            </w:tcBorders>
+            <w:shd w:fill="241B12" w:color="auto" w:val="clear"/>
+            <w:tcMar>
+              <w:top w:type="dxa" w:w="90"/>
+              <w:left w:type="dxa" w:w="110"/>
+              <w:bottom w:type="dxa" w:w="90"/>
+              <w:right w:type="dxa" w:w="110"/>
+            </w:tcMar>
+            <w:vAlign w:val="center"/>
+          </w:tcPr>
+          <w:p>
+            <w:pPr>
+              <w:spacing w:after="0" w:before="0" w:line="260"/>
+            </w:pPr>
+            <w:r>
+              <w:rPr>
+                <w:rFonts w:ascii="맑은 고딕" w:cs="맑은 고딕" w:eastAsia="맑은 고딕" w:hAnsi="맑은 고딕"/>
+                <w:b/>
+                <w:bCs/>
+                <w:color w:val="F4CF87"/>
+                <w:sz w:val="17"/>
+                <w:szCs w:val="17"/>
+              </w:rPr>
+              <w:t xml:space="preserve">결과</w:t>
+            </w:r>
+          </w:p>
+        </w:tc>
+      </w:tr>
+      <w:tr>
+        <w:tc>
+          <w:tcPr>
+            <w:tcW w:type="dxa" w:w="1500"/>
+            <w:tcBorders>
+              <w:top w:val="single" w:color="DEDEDE" w:sz="6"/>
+              <w:left w:val="single" w:color="DEDEDE" w:sz="6"/>
+              <w:bottom w:val="single" w:color="DEDEDE" w:sz="6"/>
+              <w:right w:val="single" w:color="DEDEDE" w:sz="6"/>
+            </w:tcBorders>
+            <w:tcMar>
+              <w:top w:type="dxa" w:w="70"/>
+              <w:left w:type="dxa" w:w="110"/>
+              <w:bottom w:type="dxa" w:w="70"/>
+              <w:right w:type="dxa" w:w="110"/>
+            </w:tcMar>
+            <w:vAlign w:val="center"/>
+          </w:tcPr>
+          <w:p>
+            <w:pPr>
+              <w:spacing w:after="0" w:before="0" w:line="260"/>
+            </w:pPr>
+            <w:r>
+              <w:t>launch 인자 자체가 잘못 정의됐다</w:t>
+            </w:r>
+          </w:p>
+        </w:tc>
+        <w:tc>
+          <w:tcPr>
+            <w:tcW w:type="dxa" w:w="3000"/>
+            <w:tcBorders>
+              <w:top w:val="single" w:color="DEDEDE" w:sz="6"/>
+              <w:left w:val="single" w:color="DEDEDE" w:sz="6"/>
+              <w:bottom w:val="single" w:color="DEDEDE" w:sz="6"/>
+              <w:right w:val="single" w:color="DEDEDE" w:sz="6"/>
+            </w:tcBorders>
+            <w:tcMar>
+              <w:top w:type="dxa" w:w="70"/>
+              <w:left w:type="dxa" w:w="110"/>
+              <w:bottom w:type="dxa" w:w="70"/>
+              <w:right w:type="dxa" w:w="110"/>
+            </w:tcMar>
+            <w:vAlign w:val="center"/>
+          </w:tcPr>
+          <w:p>
+            <w:pPr>
+              <w:spacing w:after="0" w:before="0" w:line="260"/>
+            </w:pPr>
+            <w:r>
+              <w:t>bringup.launch.py의 DeclareLaunchArgument 기본값과 전달값 확인</w:t>
+            </w:r>
+          </w:p>
+        </w:tc>
+        <w:tc>
+          <w:tcPr>
+            <w:tcW w:type="dxa" w:w="5246"/>
+            <w:tcBorders>
+              <w:top w:val="single" w:color="DEDEDE" w:sz="6"/>
+              <w:left w:val="single" w:color="DEDEDE" w:sz="6"/>
+              <w:bottom w:val="single" w:color="DEDEDE" w:sz="6"/>
+              <w:right w:val="single" w:color="DEDEDE" w:sz="6"/>
+            </w:tcBorders>
+            <w:tcMar>
+              <w:top w:type="dxa" w:w="70"/>
+              <w:left w:type="dxa" w:w="110"/>
+              <w:bottom w:type="dxa" w:w="70"/>
+              <w:right w:type="dxa" w:w="110"/>
+            </w:tcMar>
+            <w:vAlign w:val="center"/>
+          </w:tcPr>
+          <w:p>
+            <w:pPr>
+              <w:spacing w:after="0" w:before="0" w:line="260"/>
+            </w:pPr>
+            <w:r>
+              <w:rPr>
+                <w:rFonts w:ascii="맑은 고딕" w:cs="맑은 고딕" w:eastAsia="맑은 고딕" w:hAnsi="맑은 고딕"/>
+                <w:color w:val="3C3429"/>
+                <w:sz w:val="17"/>
+                <w:szCs w:val="17"/>
+              </w:rPr>
+              <w:t>아님 — 인자 선언은 정상, Nav2 include에 넘기는 값만 문제</w:t>
+            </w:r>
+          </w:p>
+        </w:tc>
+      </w:tr>
+      <w:tr>
+        <w:tc>
+          <w:tcPr>
+            <w:tcW w:type="dxa" w:w="1500"/>
+            <w:tcBorders>
+              <w:top w:val="single" w:color="DEDEDE" w:sz="6"/>
+              <w:left w:val="single" w:color="DEDEDE" w:sz="6"/>
+              <w:bottom w:val="single" w:color="DEDEDE" w:sz="6"/>
+              <w:right w:val="single" w:color="DEDEDE" w:sz="6"/>
+            </w:tcBorders>
+            <w:shd w:fill="FAFAFA" w:color="auto" w:val="clear"/>
+            <w:tcMar>
+              <w:top w:type="dxa" w:w="70"/>
+              <w:left w:type="dxa" w:w="110"/>
+              <w:bottom w:type="dxa" w:w="70"/>
+              <w:right w:type="dxa" w:w="110"/>
+            </w:tcMar>
+            <w:vAlign w:val="center"/>
+          </w:tcPr>
+          <w:p>
+            <w:pPr>
+              <w:spacing w:after="0" w:before="0" w:line="260"/>
+            </w:pPr>
+            <w:r>
+              <w:t>Nav2 내부 조건식이 표준 boolean 파싱과 다르게 동작한다</w:t>
+            </w:r>
+          </w:p>
+        </w:tc>
+        <w:tc>
+          <w:tcPr>
+            <w:tcW w:type="dxa" w:w="3000"/>
+            <w:tcBorders>
+              <w:top w:val="single" w:color="DEDEDE" w:sz="6"/>
+              <w:left w:val="single" w:color="DEDEDE" w:sz="6"/>
+              <w:bottom w:val="single" w:color="DEDEDE" w:sz="6"/>
+              <w:right w:val="single" w:color="DEDEDE" w:sz="6"/>
+            </w:tcBorders>
+            <w:shd w:fill="FAFAFA" w:color="auto" w:val="clear"/>
+            <w:tcMar>
+              <w:top w:type="dxa" w:w="70"/>
+              <w:left w:type="dxa" w:w="110"/>
+              <w:bottom w:type="dxa" w:w="70"/>
+              <w:right w:type="dxa" w:w="110"/>
+            </w:tcMar>
+            <w:vAlign w:val="center"/>
+          </w:tcPr>
+          <w:p>
+            <w:pPr>
+              <w:spacing w:after="0" w:before="0" w:line="260"/>
+            </w:pPr>
+            <w:r>
+              <w:t>Nav2 Humble 소스에서 해당 조건이 PythonExpression(["not ", use_composition])으로 평가되는지 확인</w:t>
+            </w:r>
+          </w:p>
+        </w:tc>
+        <w:tc>
+          <w:tcPr>
+            <w:tcW w:type="dxa" w:w="5246"/>
+            <w:tcBorders>
+              <w:top w:val="single" w:color="DEDEDE" w:sz="6"/>
+              <w:left w:val="single" w:color="DEDEDE" w:sz="6"/>
+              <w:bottom w:val="single" w:color="DEDEDE" w:sz="6"/>
+              <w:right w:val="single" w:color="DEDEDE" w:sz="6"/>
+            </w:tcBorders>
+            <w:shd w:fill="FAFAFA" w:color="auto" w:val="clear"/>
+            <w:tcMar>
+              <w:top w:type="dxa" w:w="70"/>
+              <w:left w:type="dxa" w:w="110"/>
+              <w:bottom w:type="dxa" w:w="70"/>
+              <w:right w:type="dxa" w:w="110"/>
+            </w:tcMar>
+            <w:vAlign w:val="center"/>
+          </w:tcPr>
+          <w:p>
+            <w:pPr>
+              <w:spacing w:after="0" w:before="0" w:line="260"/>
+            </w:pPr>
+            <w:r>
+              <w:rPr>
+                <w:rFonts w:ascii="맑은 고딕" w:cs="맑은 고딕" w:eastAsia="맑은 고딕" w:hAnsi="맑은 고딕"/>
+                <w:color w:val="3C3429"/>
+                <w:sz w:val="17"/>
+                <w:szCs w:val="17"/>
+              </w:rPr>
+              <w:t>맞음 — Python 리터럴 True/False만 허용, 소문자 문자열 "true"는 정의되지 않은 이름으로 평가됨</w:t>
+            </w:r>
+          </w:p>
+        </w:tc>
+      </w:tr>
+    </w:tbl>
+    <w:p>
+      <w:pPr>
+        <w:pStyle w:val="Heading3"/>
+        <w:spacing w:after="120" w:before="260" w:line="260"/>
+      </w:pPr>
+      <w:r>
+        <w:rPr>
+          <w:rFonts w:ascii="맑은 고딕" w:cs="맑은 고딕" w:eastAsia="맑은 고딕" w:hAnsi="맑은 고딕"/>
+          <w:b/>
+          <w:bCs/>
+          <w:color w:val="241B12"/>
+          <w:sz w:val="21"/>
+          <w:szCs w:val="21"/>
+        </w:rPr>
+        <w:t xml:space="preserve">원인</w:t>
+      </w:r>
+    </w:p>
+    <w:p>
+      <w:pPr>
+        <w:spacing w:after="140" w:before="0" w:line="260"/>
+      </w:pPr>
+      <w:r>
+        <w:rPr>
+          <w:rFonts w:ascii="맑은 고딕" w:cs="맑은 고딕" w:eastAsia="맑은 고딕" w:hAnsi="맑은 고딕"/>
+          <w:color w:val="3C3429"/>
+          <w:sz w:val="17"/>
+          <w:szCs w:val="17"/>
+        </w:rPr>
+        <w:t>확인됨. ROS launch의 일반 boolean 조건은 문자열 "true"도 참으로 허용하지만, Nav2 Humble 내부 일부 조건 분기는 PythonExpression(["not ", use_composition]) 형태의 Python 식으로 직접 평가된다. bringup.launch.py가 localization·navigation include에 use_composition 값을 소문자 문자열 "true"로 전달하면서 이 식이 not true로 치환됐고, Python이 true를 정의되지 않은 변수명으로 해석해 NameError가 발생했다.</w:t>
+      </w:r>
+    </w:p>
+    <w:p>
+      <w:pPr>
+        <w:pStyle w:val="Heading3"/>
+        <w:spacing w:after="120" w:before="260" w:line="260"/>
+      </w:pPr>
+      <w:r>
+        <w:rPr>
+          <w:rFonts w:ascii="맑은 고딕" w:cs="맑은 고딕" w:eastAsia="맑은 고딕" w:hAnsi="맑은 고딕"/>
+          <w:b/>
+          <w:bCs/>
+          <w:color w:val="241B12"/>
+          <w:sz w:val="21"/>
+          <w:szCs w:val="21"/>
+        </w:rPr>
+        <w:t xml:space="preserve">조치</w:t>
+      </w:r>
+    </w:p>
+    <w:tbl>
+      <w:tblPr>
+        <w:tblW w:type="dxa" w:w="9746"/>
+        <w:tblBorders>
+          <w:top w:val="single" w:color="DEDEDE" w:sz="6"/>
+          <w:left w:val="single" w:color="DEDEDE" w:sz="6"/>
+          <w:bottom w:val="single" w:color="DEDEDE" w:sz="6"/>
+          <w:right w:val="single" w:color="DEDEDE" w:sz="6"/>
+          <w:insideH w:val="single" w:color="DEDEDE" w:sz="6"/>
+          <w:insideV w:val="single" w:color="DEDEDE" w:sz="6"/>
+        </w:tblBorders>
+      </w:tblPr>
+      <w:tblGrid>
+        <w:gridCol w:w="1500"/>
+        <w:gridCol w:w="3000"/>
+        <w:gridCol w:w="5246"/>
+      </w:tblGrid>
+      <w:tr>
+        <w:trPr>
+          <w:tblHeader/>
+        </w:trPr>
+        <w:tc>
+          <w:tcPr>
+            <w:tcW w:type="dxa" w:w="1500"/>
+            <w:tcBorders>
+              <w:top w:val="single" w:color="49361D" w:sz="6"/>
+              <w:left w:val="single" w:color="49361D" w:sz="6"/>
+              <w:bottom w:val="single" w:color="49361D" w:sz="6"/>
+              <w:right w:val="single" w:color="49361D" w:sz="6"/>
+            </w:tcBorders>
+            <w:shd w:fill="241B12" w:color="auto" w:val="clear"/>
+            <w:tcMar>
+              <w:top w:type="dxa" w:w="90"/>
+              <w:left w:type="dxa" w:w="110"/>
+              <w:bottom w:type="dxa" w:w="90"/>
+              <w:right w:type="dxa" w:w="110"/>
+            </w:tcMar>
+            <w:vAlign w:val="center"/>
+          </w:tcPr>
+          <w:p>
+            <w:pPr>
+              <w:spacing w:after="0" w:before="0" w:line="260"/>
+            </w:pPr>
+            <w:r>
+              <w:rPr>
+                <w:rFonts w:ascii="맑은 고딕" w:cs="맑은 고딕" w:eastAsia="맑은 고딕" w:hAnsi="맑은 고딕"/>
+                <w:b/>
+                <w:bCs/>
+                <w:color w:val="F4CF87"/>
+                <w:sz w:val="17"/>
+                <w:szCs w:val="17"/>
+              </w:rPr>
+              <w:t xml:space="preserve">대상</w:t>
+            </w:r>
+          </w:p>
+        </w:tc>
+        <w:tc>
+          <w:tcPr>
+            <w:tcW w:type="dxa" w:w="3000"/>
+            <w:tcBorders>
+              <w:top w:val="single" w:color="49361D" w:sz="6"/>
+              <w:left w:val="single" w:color="49361D" w:sz="6"/>
+              <w:bottom w:val="single" w:color="49361D" w:sz="6"/>
+              <w:right w:val="single" w:color="49361D" w:sz="6"/>
+            </w:tcBorders>
+            <w:shd w:fill="241B12" w:color="auto" w:val="clear"/>
+            <w:tcMar>
+              <w:top w:type="dxa" w:w="90"/>
+              <w:left w:type="dxa" w:w="110"/>
+              <w:bottom w:type="dxa" w:w="90"/>
+              <w:right w:type="dxa" w:w="110"/>
+            </w:tcMar>
+            <w:vAlign w:val="center"/>
+          </w:tcPr>
+          <w:p>
+            <w:pPr>
+              <w:spacing w:after="0" w:before="0" w:line="260"/>
+            </w:pPr>
+            <w:r>
+              <w:rPr>
+                <w:rFonts w:ascii="맑은 고딕" w:cs="맑은 고딕" w:eastAsia="맑은 고딕" w:hAnsi="맑은 고딕"/>
+                <w:b/>
+                <w:bCs/>
+                <w:color w:val="F4CF87"/>
+                <w:sz w:val="17"/>
+                <w:szCs w:val="17"/>
+              </w:rPr>
+              <w:t xml:space="preserve">변경 전</w:t>
+            </w:r>
+          </w:p>
+        </w:tc>
+        <w:tc>
+          <w:tcPr>
+            <w:tcW w:type="dxa" w:w="5246"/>
+            <w:tcBorders>
+              <w:top w:val="single" w:color="49361D" w:sz="6"/>
+              <w:left w:val="single" w:color="49361D" w:sz="6"/>
+              <w:bottom w:val="single" w:color="49361D" w:sz="6"/>
+              <w:right w:val="single" w:color="49361D" w:sz="6"/>
+            </w:tcBorders>
+            <w:shd w:fill="241B12" w:color="auto" w:val="clear"/>
+            <w:tcMar>
+              <w:top w:type="dxa" w:w="90"/>
+              <w:left w:type="dxa" w:w="110"/>
+              <w:bottom w:type="dxa" w:w="90"/>
+              <w:right w:type="dxa" w:w="110"/>
+            </w:tcMar>
+            <w:vAlign w:val="center"/>
+          </w:tcPr>
+          <w:p>
+            <w:pPr>
+              <w:spacing w:after="0" w:before="0" w:line="260"/>
+            </w:pPr>
+            <w:r>
+              <w:rPr>
+                <w:rFonts w:ascii="맑은 고딕" w:cs="맑은 고딕" w:eastAsia="맑은 고딕" w:hAnsi="맑은 고딕"/>
+                <w:b/>
+                <w:bCs/>
+                <w:color w:val="F4CF87"/>
+                <w:sz w:val="17"/>
+                <w:szCs w:val="17"/>
+              </w:rPr>
+              <w:t xml:space="preserve">변경 후</w:t>
+            </w:r>
+          </w:p>
+        </w:tc>
+      </w:tr>
+      <w:tr>
+        <w:tc>
+          <w:tcPr>
+            <w:tcW w:type="dxa" w:w="1500"/>
+            <w:tcBorders>
+              <w:top w:val="single" w:color="DEDEDE" w:sz="6"/>
+              <w:left w:val="single" w:color="DEDEDE" w:sz="6"/>
+              <w:bottom w:val="single" w:color="DEDEDE" w:sz="6"/>
+              <w:right w:val="single" w:color="DEDEDE" w:sz="6"/>
+            </w:tcBorders>
+            <w:tcMar>
+              <w:top w:type="dxa" w:w="70"/>
+              <w:left w:type="dxa" w:w="110"/>
+              <w:bottom w:type="dxa" w:w="70"/>
+              <w:right w:type="dxa" w:w="110"/>
+            </w:tcMar>
+            <w:vAlign w:val="center"/>
+          </w:tcPr>
+          <w:p>
+            <w:pPr>
+              <w:spacing w:after="0" w:before="0" w:line="260"/>
+            </w:pPr>
+            <w:r>
+              <w:rPr>
+                <w:rFonts w:ascii="맑은 고딕" w:cs="맑은 고딕" w:eastAsia="맑은 고딕" w:hAnsi="맑은 고딕"/>
+                <w:color w:val="3C3429"/>
+                <w:sz w:val="17"/>
+                <w:szCs w:val="17"/>
+              </w:rPr>
+              <w:t>bringup.launch.py의 localization·navigation include</w:t>
+            </w:r>
+          </w:p>
+        </w:tc>
+        <w:tc>
+          <w:tcPr>
+            <w:tcW w:type="dxa" w:w="3000"/>
+            <w:tcBorders>
+              <w:top w:val="single" w:color="DEDEDE" w:sz="6"/>
+              <w:left w:val="single" w:color="DEDEDE" w:sz="6"/>
+              <w:bottom w:val="single" w:color="DEDEDE" w:sz="6"/>
+              <w:right w:val="single" w:color="DEDEDE" w:sz="6"/>
+            </w:tcBorders>
+            <w:tcMar>
+              <w:top w:type="dxa" w:w="70"/>
+              <w:left w:type="dxa" w:w="110"/>
+              <w:bottom w:type="dxa" w:w="70"/>
+              <w:right w:type="dxa" w:w="110"/>
+            </w:tcMar>
+            <w:vAlign w:val="center"/>
+          </w:tcPr>
+          <w:p>
+            <w:pPr>
+              <w:spacing w:after="0" w:before="0" w:line="260"/>
+            </w:pPr>
+            <w:r>
+              <w:t>use_composition="true" (소문자 문자열)</w:t>
+            </w:r>
+          </w:p>
+        </w:tc>
+        <w:tc>
+          <w:tcPr>
+            <w:tcW w:type="dxa" w:w="5246"/>
+            <w:tcBorders>
+              <w:top w:val="single" w:color="DEDEDE" w:sz="6"/>
+              <w:left w:val="single" w:color="DEDEDE" w:sz="6"/>
+              <w:bottom w:val="single" w:color="DEDEDE" w:sz="6"/>
+              <w:right w:val="single" w:color="DEDEDE" w:sz="6"/>
+            </w:tcBorders>
+            <w:tcMar>
+              <w:top w:type="dxa" w:w="70"/>
+              <w:left w:type="dxa" w:w="110"/>
+              <w:bottom w:type="dxa" w:w="70"/>
+              <w:right w:type="dxa" w:w="110"/>
+            </w:tcMar>
+            <w:vAlign w:val="center"/>
+          </w:tcPr>
+          <w:p>
+            <w:pPr>
+              <w:spacing w:after="0" w:before="0" w:line="260"/>
+            </w:pPr>
+            <w:r>
+              <w:t>use_composition="True" (Python 리터럴)</w:t>
+            </w:r>
+          </w:p>
+        </w:tc>
+      </w:tr>
+    </w:tbl>
+    <w:tbl>
+      <w:tblPr>
+        <w:tblW w:type="dxa" w:w="9746"/>
+        <w:tblBorders>
+          <w:top w:val="single" w:color="DEDEDE" w:sz="6"/>
+          <w:left w:val="single" w:color="DEDEDE" w:sz="6"/>
+          <w:bottom w:val="single" w:color="DEDEDE" w:sz="6"/>
+          <w:right w:val="single" w:color="DEDEDE" w:sz="6"/>
+          <w:insideH w:val="single" w:color="DEDEDE" w:sz="6"/>
+          <w:insideV w:val="single" w:color="DEDEDE" w:sz="6"/>
+        </w:tblBorders>
+      </w:tblPr>
+      <w:tblGrid>
+        <w:gridCol w:w="9746"/>
+      </w:tblGrid>
+      <w:tr>
+        <w:tc>
+          <w:tcPr>
+            <w:tcW w:type="dxa" w:w="9746"/>
+            <w:tcBorders>
+              <w:top w:val="single" w:color="DEDEDE" w:sz="6"/>
+              <w:left w:val="single" w:color="DEDEDE" w:sz="6"/>
+              <w:bottom w:val="single" w:color="DEDEDE" w:sz="6"/>
+              <w:right w:val="single" w:color="DEDEDE" w:sz="6"/>
+            </w:tcBorders>
+            <w:shd w:fill="F7F8FA" w:color="auto" w:val="clear"/>
+            <w:tcMar>
+              <w:top w:type="dxa" w:w="140"/>
+              <w:left w:type="dxa" w:w="160"/>
+              <w:bottom w:type="dxa" w:w="140"/>
+              <w:right w:type="dxa" w:w="160"/>
+            </w:tcMar>
+          </w:tcPr>
+          <w:p>
+            <w:pPr>
+              <w:spacing w:after="20" w:line="240"/>
+            </w:pPr>
+            <w:r>
+              <w:rPr>
+                <w:rFonts w:ascii="Consolas" w:cs="Consolas" w:eastAsia="Consolas" w:hAnsi="Consolas"/>
+                <w:color w:val="3C3429"/>
+                <w:sz w:val="16"/>
+                <w:szCs w:val="16"/>
+              </w:rPr>
+              <w:t># 변경 파일</w:t>
+              <w:br/>
+              <w:t>src/medirun_bringup/launch/bringup.launch.py — localization·navigation include의 use_composition 전달값을 "true" → "True"로 수정</w:t>
+            </w:r>
+          </w:p>
+        </w:tc>
+      </w:tr>
+    </w:tbl>
+    <w:p>
+      <w:pPr>
+        <w:pStyle w:val="Heading3"/>
+        <w:spacing w:after="120" w:before="260" w:line="260"/>
+      </w:pPr>
+      <w:r>
+        <w:rPr>
+          <w:rFonts w:ascii="맑은 고딕" w:cs="맑은 고딕" w:eastAsia="맑은 고딕" w:hAnsi="맑은 고딕"/>
+          <w:b/>
+          <w:bCs/>
+          <w:color w:val="241B12"/>
+          <w:sz w:val="21"/>
+          <w:szCs w:val="21"/>
+        </w:rPr>
+        <w:t xml:space="preserve">검증</w:t>
+      </w:r>
+    </w:p>
+    <w:p>
+      <w:pPr>
+        <w:pStyle w:val="ListParagraph"/>
+        <w:numPr>
+          <w:ilvl w:val="0"/>
+          <w:numId w:val="2"/>
+        </w:numPr>
+        <w:spacing w:after="80" w:line="260"/>
+      </w:pPr>
+      <w:r>
+        <w:rPr>
+          <w:rFonts w:ascii="맑은 고딕" w:cs="맑은 고딕" w:eastAsia="맑은 고딕" w:hAnsi="맑은 고딕"/>
+          <w:color w:val="3C3429"/>
+          <w:sz w:val="17"/>
+          <w:szCs w:val="17"/>
+        </w:rPr>
+        <w:t>수정 후 재빌드한 bringup.launch.py로 ./scripts/run.sh use_gui:=false use_rviz:=false를 실행해 launch가 중단 없이 끝까지 진행됨을 확인</w:t>
+      </w:r>
+    </w:p>
+    <w:p>
+      <w:pPr>
+        <w:pStyle w:val="ListParagraph"/>
+        <w:numPr>
+          <w:ilvl w:val="0"/>
+          <w:numId w:val="2"/>
+        </w:numPr>
+        <w:spacing w:after="80" w:line="260"/>
+      </w:pPr>
+      <w:r>
+        <w:rPr>
+          <w:rFonts w:ascii="맑은 고딕" w:cs="맑은 고딕" w:eastAsia="맑은 고딕" w:hAnsi="맑은 고딕"/>
+          <w:color w:val="3C3429"/>
+          <w:sz w:val="17"/>
+          <w:szCs w:val="17"/>
+        </w:rPr>
+        <w:t>map server, AMCL, controller, planner, behavior server, BT navigator, waypoint follower, velocity smoother, ultrasonic_safety_stop 노드가 모두 정상 로드됨을 확인</w:t>
+      </w:r>
+    </w:p>
+    <w:p>
+      <w:pPr>
+        <w:pStyle w:val="ListParagraph"/>
+        <w:numPr>
+          <w:ilvl w:val="0"/>
+          <w:numId w:val="2"/>
+        </w:numPr>
+        <w:spacing w:after="80" w:line="260"/>
+      </w:pPr>
+      <w:r>
+        <w:rPr>
+          <w:rFonts w:ascii="맑은 고딕" w:cs="맑은 고딕" w:eastAsia="맑은 고딕" w:hAnsi="맑은 고딕"/>
+          <w:color w:val="3C3429"/>
+          <w:sz w:val="17"/>
+          <w:szCs w:val="17"/>
+        </w:rPr>
+        <w:t>시험 종료 후 pgrep -af로 잔여 프로세스가 없음을 확인</w:t>
+      </w:r>
+    </w:p>
+    <w:p>
+      <w:pPr>
+        <w:pStyle w:val="Heading3"/>
+        <w:spacing w:after="120" w:before="260" w:line="260"/>
+      </w:pPr>
+      <w:r>
+        <w:rPr>
+          <w:rFonts w:ascii="맑은 고딕" w:cs="맑은 고딕" w:eastAsia="맑은 고딕" w:hAnsi="맑은 고딕"/>
+          <w:b/>
+          <w:bCs/>
+          <w:color w:val="241B12"/>
+          <w:sz w:val="21"/>
+          <w:szCs w:val="21"/>
+        </w:rPr>
+        <w:t xml:space="preserve">재발 방지</w:t>
+      </w:r>
+    </w:p>
+    <w:tbl>
+      <w:tblPr>
+        <w:tblW w:type="dxa" w:w="9746"/>
+        <w:tblBorders>
+          <w:top w:val="single" w:color="DEDEDE" w:sz="6"/>
+          <w:left w:val="single" w:color="DEDEDE" w:sz="6"/>
+          <w:bottom w:val="single" w:color="DEDEDE" w:sz="6"/>
+          <w:right w:val="single" w:color="DEDEDE" w:sz="6"/>
+          <w:insideH w:val="single" w:color="DEDEDE" w:sz="6"/>
+          <w:insideV w:val="single" w:color="DEDEDE" w:sz="6"/>
+        </w:tblBorders>
+      </w:tblPr>
+      <w:tblGrid>
+        <w:gridCol w:w="2600"/>
+        <w:gridCol w:w="7146"/>
+      </w:tblGrid>
+      <w:tr>
+        <w:trPr>
+          <w:tblHeader/>
+        </w:trPr>
+        <w:tc>
+          <w:tcPr>
+            <w:tcW w:type="dxa" w:w="2600"/>
+            <w:tcBorders>
+              <w:top w:val="single" w:color="49361D" w:sz="6"/>
+              <w:left w:val="single" w:color="49361D" w:sz="6"/>
+              <w:bottom w:val="single" w:color="49361D" w:sz="6"/>
+              <w:right w:val="single" w:color="49361D" w:sz="6"/>
+            </w:tcBorders>
+            <w:shd w:fill="241B12" w:color="auto" w:val="clear"/>
+            <w:tcMar>
+              <w:top w:type="dxa" w:w="90"/>
+              <w:left w:type="dxa" w:w="110"/>
+              <w:bottom w:type="dxa" w:w="90"/>
+              <w:right w:type="dxa" w:w="110"/>
+            </w:tcMar>
+            <w:vAlign w:val="center"/>
+          </w:tcPr>
+          <w:p>
+            <w:pPr>
+              <w:spacing w:after="0" w:before="0" w:line="260"/>
+            </w:pPr>
+            <w:r>
+              <w:rPr>
+                <w:rFonts w:ascii="맑은 고딕" w:cs="맑은 고딕" w:eastAsia="맑은 고딕" w:hAnsi="맑은 고딕"/>
+                <w:b/>
+                <w:bCs/>
+                <w:color w:val="F4CF87"/>
+                <w:sz w:val="17"/>
+                <w:szCs w:val="17"/>
+              </w:rPr>
+              <w:t xml:space="preserve">반영 위치</w:t>
+            </w:r>
+          </w:p>
+        </w:tc>
+        <w:tc>
+          <w:tcPr>
+            <w:tcW w:type="dxa" w:w="7146"/>
+            <w:tcBorders>
+              <w:top w:val="single" w:color="49361D" w:sz="6"/>
+              <w:left w:val="single" w:color="49361D" w:sz="6"/>
+              <w:bottom w:val="single" w:color="49361D" w:sz="6"/>
+              <w:right w:val="single" w:color="49361D" w:sz="6"/>
+            </w:tcBorders>
+            <w:shd w:fill="241B12" w:color="auto" w:val="clear"/>
+            <w:tcMar>
+              <w:top w:type="dxa" w:w="90"/>
+              <w:left w:type="dxa" w:w="110"/>
+              <w:bottom w:type="dxa" w:w="90"/>
+              <w:right w:type="dxa" w:w="110"/>
+            </w:tcMar>
+            <w:vAlign w:val="center"/>
+          </w:tcPr>
+          <w:p>
+            <w:pPr>
+              <w:spacing w:after="0" w:before="0" w:line="260"/>
+            </w:pPr>
+            <w:r>
+              <w:rPr>
+                <w:rFonts w:ascii="맑은 고딕" w:cs="맑은 고딕" w:eastAsia="맑은 고딕" w:hAnsi="맑은 고딕"/>
+                <w:b/>
+                <w:bCs/>
+                <w:color w:val="F4CF87"/>
+                <w:sz w:val="17"/>
+                <w:szCs w:val="17"/>
+              </w:rPr>
+              <w:t xml:space="preserve">내용</w:t>
+            </w:r>
+          </w:p>
+        </w:tc>
+      </w:tr>
+      <w:tr>
+        <w:tc>
+          <w:tcPr>
+            <w:tcW w:type="dxa" w:w="2600"/>
+            <w:tcBorders>
+              <w:top w:val="single" w:color="DEDEDE" w:sz="6"/>
+              <w:left w:val="single" w:color="DEDEDE" w:sz="6"/>
+              <w:bottom w:val="single" w:color="DEDEDE" w:sz="6"/>
+              <w:right w:val="single" w:color="DEDEDE" w:sz="6"/>
+            </w:tcBorders>
+            <w:tcMar>
+              <w:top w:type="dxa" w:w="70"/>
+              <w:left w:type="dxa" w:w="110"/>
+              <w:bottom w:type="dxa" w:w="70"/>
+              <w:right w:type="dxa" w:w="110"/>
+            </w:tcMar>
+            <w:vAlign w:val="center"/>
+          </w:tcPr>
+          <w:p>
+            <w:pPr>
+              <w:spacing w:after="0" w:before="0" w:line="260"/>
+            </w:pPr>
+            <w:r>
+              <w:rPr>
+                <w:rFonts w:ascii="맑은 고딕" w:cs="맑은 고딕" w:eastAsia="맑은 고딕" w:hAnsi="맑은 고딕"/>
+                <w:color w:val="3C3429"/>
+                <w:sz w:val="17"/>
+                <w:szCs w:val="17"/>
+              </w:rPr>
+              <w:t>규칙</w:t>
+            </w:r>
+          </w:p>
+        </w:tc>
+        <w:tc>
+          <w:tcPr>
+            <w:tcW w:type="dxa" w:w="7146"/>
+            <w:tcBorders>
+              <w:top w:val="single" w:color="DEDEDE" w:sz="6"/>
+              <w:left w:val="single" w:color="DEDEDE" w:sz="6"/>
+              <w:bottom w:val="single" w:color="DEDEDE" w:sz="6"/>
+              <w:right w:val="single" w:color="DEDEDE" w:sz="6"/>
+            </w:tcBorders>
+            <w:tcMar>
+              <w:top w:type="dxa" w:w="70"/>
+              <w:left w:type="dxa" w:w="110"/>
+              <w:bottom w:type="dxa" w:w="70"/>
+              <w:right w:type="dxa" w:w="110"/>
+            </w:tcMar>
+            <w:vAlign w:val="center"/>
+          </w:tcPr>
+          <w:p>
+            <w:pPr>
+              <w:spacing w:after="0" w:before="0" w:line="260"/>
+            </w:pPr>
+            <w:r>
+              <w:t>Nav2 include에 불리언 값을 전달할 때는 소문자 문자열이 아닌 Python 리터럴 표기("True"/"False")를 사용한다. launch가 중간에 실패하면 이전 프로세스(특히 component container)가 남을 수 있으므로 pgrep -af로 실제 PID를 확인한 뒤 해당 PID만 종료하고, 이름 전체를 대상으로 한 광범위한 pkill은 쓰지 않는다.</w:t>
             </w:r>
           </w:p>
         </w:tc>

</xml_diff>